<commit_message>
Add LLM paraphrase attack results (generic rewrite does not evade the screen); update paper
Co-Authored-By: Claude Sonnet 5.5 <noreply@anthropic.com>
Claude-Session: https://claude.ai/code/session_01FLb7uVf7YBgdoa75gbZ2sf
</commit_message>
<xml_diff>
--- a/paper/Screening_Economics_Paper.docx
+++ b/paper/Screening_Economics_Paper.docx
@@ -212,7 +212,7 @@
         <w:pStyle w:val="FirstParagraph"/>
       </w:pPr>
       <w:r>
-        <w:t xml:space="preserve">Publishers and archives must decide how much to spend on screening documents for machine authorship, yet detection research reports accuracy without costs, base rates, or adaptive authors. We develop a decision model of a two-stage screen, in which a free statistical screen decides which documents reach a costly LLM judge, and we extend it to authors who choose how hard to evade. The model implies that the screen mainly raises the base rate the judge sees, that a judge with a blind spot is not worth calling, and that a publicly known screen can lose most of its power. We calibrate the model with 474 human papers and papers from GPT-4o, Claude, and Llama. A cheap count-based screen detects machine papers well only within a generator, a strong judge misses Claude, a cascade keeps most detection at a fraction of the cost, and a feature-aware edit cuts detection from 53% to 8%.</w:t>
+        <w:t xml:space="preserve">Publishers must decide how much to spend screening documents for machine authorship, yet detection research ignores costs, base rates, and adaptive authors. We develop a decision model of a two-stage screen, in which a free screen decides which documents reach a costly LLM judge, and extend it to authors who choose how hard to evade. The model implies that the screen mainly raises the base rate the judge sees, that a judge with a blind spot is not worth calling, and that a publicly known screen can lose most of its power. We calibrate the model with 474 human papers and papers from GPT-4o, Claude, and Llama. A count-based screen detects machine papers well only within a generator, a strong judge misses Claude, a cascade keeps most detection at lower cost, and a feature-aware edit cuts detection from 53% to 8%, whereas a generic LLM rewrite does not evade it.</w:t>
       </w:r>
     </w:p>
     <w:p>
@@ -8561,6 +8561,1090 @@
         </w:tc>
       </w:tr>
     </w:tbl>
+    <w:p>
+      <w:pPr>
+        <w:pStyle w:val="BodyText"/>
+      </w:pPr>
+      <w:r>
+        <w:t xml:space="preserve">We also tested a generic attack that needs no knowledge of the features. A language model, Llama 3.3 70B Instruct, rewrote each machine paper in the judge sample (300 papers, 100 per generator) after being asked to make it read as if written by an experienced human researcher; the papers were rewritten in chunks of 1,000 tokens with the target length stated, at a cost of about US$0.003 per paper. Because the attacker is itself one of the generators, a screen trained on</w:t>
+      </w:r>
+      <w:r>
+        <w:t xml:space="preserve"> </w:t>
+      </w:r>
+      <w:r>
+        <w:t xml:space="preserve">“</w:t>
+      </w:r>
+      <w:r>
+        <w:t xml:space="preserve">other generators</w:t>
+      </w:r>
+      <w:r>
+        <w:t xml:space="preserve">”</w:t>
+      </w:r>
+      <w:r>
+        <w:t xml:space="preserve"> </w:t>
+      </w:r>
+      <w:r>
+        <w:t xml:space="preserve">has seen its style when the target is GPT-4o or Claude, so Table 12 reports both the standard protocol and one that excludes Llama from training. The rewrite did not evade the screen. Averaged over generators, the AUC rose from 0.885 to 0.914 under the standard protocol and from 0.837 to 0.884 with Llama excluded, and the share detected at a 5% false-positive rate stayed at about 0.53 or rose from 0.37 to 0.42. For Claude papers the rewrite made detection clearly easier (AUC 0.750 to 0.905 with Llama excluded); for GPT-4o papers it changed little (0.830 to 0.813).</w:t>
+      </w:r>
+    </w:p>
+    <w:p>
+      <w:pPr>
+        <w:pStyle w:val="TableCaption"/>
+      </w:pPr>
+      <w:r>
+        <w:t xml:space="preserve">Table 12. Effect of a generic LLM rewrite on detection by the clustering screen: AUC / share of machine papers detected at a 5% false-positive rate, on the same papers before and after the rewrite. The last two columns exclude Llama, the attacker, from the screen’s training. For Llama papers the attacker and the target coincide, so the two protocols are identical.</w:t>
+      </w:r>
+    </w:p>
+    <w:tbl>
+      <w:tblPr>
+        <w:tblStyle w:val="Table"/>
+        <w:tblW w:type="pct" w:w="5000"/>
+        <w:tblLayout w:type="autofit"/>
+        <w:tblLook w:firstRow="1" w:lastRow="0" w:firstColumn="0" w:lastColumn="0" w:noHBand="0" w:noVBand="0" w:val="0020"/>
+        <w:jc w:val="start"/>
+        <w:tblCaption w:val="Table 12. Effect of a generic LLM rewrite on detection by the clustering screen: AUC / share of machine papers detected at a 5% false-positive rate, on the same papers before and after the rewrite. The last two columns exclude Llama, the attacker, from the screen’s training. For Llama papers the attacker and the target coincide, so the two protocols are identical."/>
+      </w:tblPr>
+      <w:tblGrid>
+        <w:gridCol w:w="1584"/>
+        <w:gridCol w:w="1584"/>
+        <w:gridCol w:w="1584"/>
+        <w:gridCol w:w="1584"/>
+        <w:gridCol w:w="1584"/>
+      </w:tblGrid>
+      <w:tr>
+        <w:trPr>
+          <w:tblHeader w:val="true"/>
+        </w:trPr>
+        <w:tc>
+          <w:tcPr>
+            <w:tcBorders>
+              <w:top w:val="single" w:sz="10" w:color="000000"/>
+              <w:bottom w:val="single" w:sz="6" w:color="000000"/>
+            </w:tcBorders>
+          </w:tcPr>
+          <w:p>
+            <w:pPr>
+              <w:pStyle w:val="Compact"/>
+              <w:spacing w:after="20" w:before="20" w:line="240" w:lineRule="auto"/>
+              <w:jc w:val="left"/>
+            </w:pPr>
+            <w:r>
+              <w:rPr>
+                <w:rFonts w:ascii="Times New Roman" w:hAnsi="Times New Roman"/>
+                <w:b/>
+                <w:sz w:val="17"/>
+              </w:rPr>
+              <w:t xml:space="preserve">Target</w:t>
+            </w:r>
+          </w:p>
+        </w:tc>
+        <w:tc>
+          <w:tcPr>
+            <w:tcBorders>
+              <w:top w:val="single" w:sz="10" w:color="000000"/>
+              <w:bottom w:val="single" w:sz="6" w:color="000000"/>
+            </w:tcBorders>
+          </w:tcPr>
+          <w:p>
+            <w:pPr>
+              <w:pStyle w:val="Compact"/>
+              <w:spacing w:after="20" w:before="20" w:line="240" w:lineRule="auto"/>
+              <w:jc w:val="left"/>
+            </w:pPr>
+            <w:r>
+              <w:rPr>
+                <w:rFonts w:ascii="Times New Roman" w:hAnsi="Times New Roman"/>
+                <w:b/>
+                <w:sz w:val="17"/>
+              </w:rPr>
+              <w:t xml:space="preserve">Original: AUC / detected</w:t>
+            </w:r>
+          </w:p>
+        </w:tc>
+        <w:tc>
+          <w:tcPr>
+            <w:tcBorders>
+              <w:top w:val="single" w:sz="10" w:color="000000"/>
+              <w:bottom w:val="single" w:sz="6" w:color="000000"/>
+            </w:tcBorders>
+          </w:tcPr>
+          <w:p>
+            <w:pPr>
+              <w:pStyle w:val="Compact"/>
+              <w:spacing w:after="20" w:before="20" w:line="240" w:lineRule="auto"/>
+              <w:jc w:val="left"/>
+            </w:pPr>
+            <w:r>
+              <w:rPr>
+                <w:rFonts w:ascii="Times New Roman" w:hAnsi="Times New Roman"/>
+                <w:b/>
+                <w:sz w:val="17"/>
+              </w:rPr>
+              <w:t xml:space="preserve">Rewritten: AUC / detected</w:t>
+            </w:r>
+          </w:p>
+        </w:tc>
+        <w:tc>
+          <w:tcPr>
+            <w:tcBorders>
+              <w:top w:val="single" w:sz="10" w:color="000000"/>
+              <w:bottom w:val="single" w:sz="6" w:color="000000"/>
+            </w:tcBorders>
+          </w:tcPr>
+          <w:p>
+            <w:pPr>
+              <w:pStyle w:val="Compact"/>
+              <w:spacing w:after="20" w:before="20" w:line="240" w:lineRule="auto"/>
+              <w:jc w:val="left"/>
+            </w:pPr>
+            <w:r>
+              <w:rPr>
+                <w:rFonts w:ascii="Times New Roman" w:hAnsi="Times New Roman"/>
+                <w:b/>
+                <w:sz w:val="17"/>
+              </w:rPr>
+              <w:t xml:space="preserve">Original (Llama excluded)</w:t>
+            </w:r>
+          </w:p>
+        </w:tc>
+        <w:tc>
+          <w:tcPr>
+            <w:tcBorders>
+              <w:top w:val="single" w:sz="10" w:color="000000"/>
+              <w:bottom w:val="single" w:sz="6" w:color="000000"/>
+            </w:tcBorders>
+          </w:tcPr>
+          <w:p>
+            <w:pPr>
+              <w:pStyle w:val="Compact"/>
+              <w:spacing w:after="20" w:before="20" w:line="240" w:lineRule="auto"/>
+              <w:jc w:val="left"/>
+            </w:pPr>
+            <w:r>
+              <w:rPr>
+                <w:rFonts w:ascii="Times New Roman" w:hAnsi="Times New Roman"/>
+                <w:b/>
+                <w:sz w:val="17"/>
+              </w:rPr>
+              <w:t xml:space="preserve">Rewritten (Llama excluded)</w:t>
+            </w:r>
+          </w:p>
+        </w:tc>
+      </w:tr>
+      <w:tr>
+        <w:tc>
+          <w:tcPr/>
+          <w:p>
+            <w:pPr>
+              <w:pStyle w:val="Compact"/>
+              <w:spacing w:after="20" w:before="20" w:line="240" w:lineRule="auto"/>
+              <w:jc w:val="left"/>
+            </w:pPr>
+            <w:r>
+              <w:rPr>
+                <w:rFonts w:ascii="Times New Roman" w:hAnsi="Times New Roman"/>
+                <w:sz w:val="17"/>
+              </w:rPr>
+              <w:t xml:space="preserve">GPT-4o</w:t>
+            </w:r>
+          </w:p>
+        </w:tc>
+        <w:tc>
+          <w:tcPr/>
+          <w:p>
+            <w:pPr>
+              <w:pStyle w:val="Compact"/>
+              <w:spacing w:after="20" w:before="20" w:line="240" w:lineRule="auto"/>
+              <w:jc w:val="left"/>
+            </w:pPr>
+            <w:r>
+              <w:rPr>
+                <w:rFonts w:ascii="Times New Roman" w:hAnsi="Times New Roman"/>
+                <w:sz w:val="17"/>
+              </w:rPr>
+              <w:t xml:space="preserve">0.950 / 0.71</w:t>
+            </w:r>
+          </w:p>
+        </w:tc>
+        <w:tc>
+          <w:tcPr/>
+          <w:p>
+            <w:pPr>
+              <w:pStyle w:val="Compact"/>
+              <w:spacing w:after="20" w:before="20" w:line="240" w:lineRule="auto"/>
+              <w:jc w:val="left"/>
+            </w:pPr>
+            <w:r>
+              <w:rPr>
+                <w:rFonts w:ascii="Times New Roman" w:hAnsi="Times New Roman"/>
+                <w:sz w:val="17"/>
+              </w:rPr>
+              <w:t xml:space="preserve">0.924 / 0.54</w:t>
+            </w:r>
+          </w:p>
+        </w:tc>
+        <w:tc>
+          <w:tcPr/>
+          <w:p>
+            <w:pPr>
+              <w:pStyle w:val="Compact"/>
+              <w:spacing w:after="20" w:before="20" w:line="240" w:lineRule="auto"/>
+              <w:jc w:val="left"/>
+            </w:pPr>
+            <w:r>
+              <w:rPr>
+                <w:rFonts w:ascii="Times New Roman" w:hAnsi="Times New Roman"/>
+                <w:sz w:val="17"/>
+              </w:rPr>
+              <w:t xml:space="preserve">0.830 / 0.20</w:t>
+            </w:r>
+          </w:p>
+        </w:tc>
+        <w:tc>
+          <w:tcPr/>
+          <w:p>
+            <w:pPr>
+              <w:pStyle w:val="Compact"/>
+              <w:spacing w:after="20" w:before="20" w:line="240" w:lineRule="auto"/>
+              <w:jc w:val="left"/>
+            </w:pPr>
+            <w:r>
+              <w:rPr>
+                <w:rFonts w:ascii="Times New Roman" w:hAnsi="Times New Roman"/>
+                <w:sz w:val="17"/>
+              </w:rPr>
+              <w:t xml:space="preserve">0.813 / 0.11</w:t>
+            </w:r>
+          </w:p>
+        </w:tc>
+      </w:tr>
+      <w:tr>
+        <w:tc>
+          <w:tcPr/>
+          <w:p>
+            <w:pPr>
+              <w:pStyle w:val="Compact"/>
+              <w:spacing w:after="20" w:before="20" w:line="240" w:lineRule="auto"/>
+              <w:jc w:val="left"/>
+            </w:pPr>
+            <w:r>
+              <w:rPr>
+                <w:rFonts w:ascii="Times New Roman" w:hAnsi="Times New Roman"/>
+                <w:sz w:val="17"/>
+              </w:rPr>
+              <w:t xml:space="preserve">Claude</w:t>
+            </w:r>
+          </w:p>
+        </w:tc>
+        <w:tc>
+          <w:tcPr/>
+          <w:p>
+            <w:pPr>
+              <w:pStyle w:val="Compact"/>
+              <w:spacing w:after="20" w:before="20" w:line="240" w:lineRule="auto"/>
+              <w:jc w:val="left"/>
+            </w:pPr>
+            <w:r>
+              <w:rPr>
+                <w:rFonts w:ascii="Times New Roman" w:hAnsi="Times New Roman"/>
+                <w:sz w:val="17"/>
+              </w:rPr>
+              <w:t xml:space="preserve">0.773 / 0.22</w:t>
+            </w:r>
+          </w:p>
+        </w:tc>
+        <w:tc>
+          <w:tcPr/>
+          <w:p>
+            <w:pPr>
+              <w:pStyle w:val="Compact"/>
+              <w:spacing w:after="20" w:before="20" w:line="240" w:lineRule="auto"/>
+              <w:jc w:val="left"/>
+            </w:pPr>
+            <w:r>
+              <w:rPr>
+                <w:rFonts w:ascii="Times New Roman" w:hAnsi="Times New Roman"/>
+                <w:sz w:val="17"/>
+              </w:rPr>
+              <w:t xml:space="preserve">0.884 / 0.42</w:t>
+            </w:r>
+          </w:p>
+        </w:tc>
+        <w:tc>
+          <w:tcPr/>
+          <w:p>
+            <w:pPr>
+              <w:pStyle w:val="Compact"/>
+              <w:spacing w:after="20" w:before="20" w:line="240" w:lineRule="auto"/>
+              <w:jc w:val="left"/>
+            </w:pPr>
+            <w:r>
+              <w:rPr>
+                <w:rFonts w:ascii="Times New Roman" w:hAnsi="Times New Roman"/>
+                <w:sz w:val="17"/>
+              </w:rPr>
+              <w:t xml:space="preserve">0.750 / 0.21</w:t>
+            </w:r>
+          </w:p>
+        </w:tc>
+        <w:tc>
+          <w:tcPr/>
+          <w:p>
+            <w:pPr>
+              <w:pStyle w:val="Compact"/>
+              <w:spacing w:after="20" w:before="20" w:line="240" w:lineRule="auto"/>
+              <w:jc w:val="left"/>
+            </w:pPr>
+            <w:r>
+              <w:rPr>
+                <w:rFonts w:ascii="Times New Roman" w:hAnsi="Times New Roman"/>
+                <w:sz w:val="17"/>
+              </w:rPr>
+              <w:t xml:space="preserve">0.905 / 0.51</w:t>
+            </w:r>
+          </w:p>
+        </w:tc>
+      </w:tr>
+      <w:tr>
+        <w:tc>
+          <w:tcPr/>
+          <w:p>
+            <w:pPr>
+              <w:pStyle w:val="Compact"/>
+              <w:spacing w:after="20" w:before="20" w:line="240" w:lineRule="auto"/>
+              <w:jc w:val="left"/>
+            </w:pPr>
+            <w:r>
+              <w:rPr>
+                <w:rFonts w:ascii="Times New Roman" w:hAnsi="Times New Roman"/>
+                <w:sz w:val="17"/>
+              </w:rPr>
+              <w:t xml:space="preserve">Llama</w:t>
+            </w:r>
+          </w:p>
+        </w:tc>
+        <w:tc>
+          <w:tcPr/>
+          <w:p>
+            <w:pPr>
+              <w:pStyle w:val="Compact"/>
+              <w:spacing w:after="20" w:before="20" w:line="240" w:lineRule="auto"/>
+              <w:jc w:val="left"/>
+            </w:pPr>
+            <w:r>
+              <w:rPr>
+                <w:rFonts w:ascii="Times New Roman" w:hAnsi="Times New Roman"/>
+                <w:sz w:val="17"/>
+              </w:rPr>
+              <w:t xml:space="preserve">0.932 / 0.70</w:t>
+            </w:r>
+          </w:p>
+        </w:tc>
+        <w:tc>
+          <w:tcPr/>
+          <w:p>
+            <w:pPr>
+              <w:pStyle w:val="Compact"/>
+              <w:spacing w:after="20" w:before="20" w:line="240" w:lineRule="auto"/>
+              <w:jc w:val="left"/>
+            </w:pPr>
+            <w:r>
+              <w:rPr>
+                <w:rFonts w:ascii="Times New Roman" w:hAnsi="Times New Roman"/>
+                <w:sz w:val="17"/>
+              </w:rPr>
+              <w:t xml:space="preserve">0.935 / 0.63</w:t>
+            </w:r>
+          </w:p>
+        </w:tc>
+        <w:tc>
+          <w:tcPr/>
+          <w:p>
+            <w:pPr>
+              <w:pStyle w:val="Compact"/>
+              <w:spacing w:after="20" w:before="20" w:line="240" w:lineRule="auto"/>
+              <w:jc w:val="left"/>
+            </w:pPr>
+            <w:r>
+              <w:rPr>
+                <w:rFonts w:ascii="Times New Roman" w:hAnsi="Times New Roman"/>
+                <w:sz w:val="17"/>
+              </w:rPr>
+              <w:t xml:space="preserve">0.932 / 0.70</w:t>
+            </w:r>
+          </w:p>
+        </w:tc>
+        <w:tc>
+          <w:tcPr/>
+          <w:p>
+            <w:pPr>
+              <w:pStyle w:val="Compact"/>
+              <w:spacing w:after="20" w:before="20" w:line="240" w:lineRule="auto"/>
+              <w:jc w:val="left"/>
+            </w:pPr>
+            <w:r>
+              <w:rPr>
+                <w:rFonts w:ascii="Times New Roman" w:hAnsi="Times New Roman"/>
+                <w:sz w:val="17"/>
+              </w:rPr>
+              <w:t xml:space="preserve">0.935 / 0.63</w:t>
+            </w:r>
+          </w:p>
+        </w:tc>
+      </w:tr>
+      <w:tr>
+        <w:tc>
+          <w:tcPr>
+            <w:tcBorders>
+              <w:bottom w:val="single" w:sz="10" w:color="000000"/>
+            </w:tcBorders>
+          </w:tcPr>
+          <w:p>
+            <w:pPr>
+              <w:pStyle w:val="Compact"/>
+              <w:spacing w:after="20" w:before="20" w:line="240" w:lineRule="auto"/>
+              <w:jc w:val="left"/>
+            </w:pPr>
+            <w:r>
+              <w:rPr>
+                <w:rFonts w:ascii="Times New Roman" w:hAnsi="Times New Roman"/>
+                <w:sz w:val="17"/>
+              </w:rPr>
+              <w:t xml:space="preserve">Mixture</w:t>
+            </w:r>
+          </w:p>
+        </w:tc>
+        <w:tc>
+          <w:tcPr>
+            <w:tcBorders>
+              <w:bottom w:val="single" w:sz="10" w:color="000000"/>
+            </w:tcBorders>
+          </w:tcPr>
+          <w:p>
+            <w:pPr>
+              <w:pStyle w:val="Compact"/>
+              <w:spacing w:after="20" w:before="20" w:line="240" w:lineRule="auto"/>
+              <w:jc w:val="left"/>
+            </w:pPr>
+            <w:r>
+              <w:rPr>
+                <w:rFonts w:ascii="Times New Roman" w:hAnsi="Times New Roman"/>
+                <w:sz w:val="17"/>
+              </w:rPr>
+              <w:t xml:space="preserve">0.885 / 0.54</w:t>
+            </w:r>
+          </w:p>
+        </w:tc>
+        <w:tc>
+          <w:tcPr>
+            <w:tcBorders>
+              <w:bottom w:val="single" w:sz="10" w:color="000000"/>
+            </w:tcBorders>
+          </w:tcPr>
+          <w:p>
+            <w:pPr>
+              <w:pStyle w:val="Compact"/>
+              <w:spacing w:after="20" w:before="20" w:line="240" w:lineRule="auto"/>
+              <w:jc w:val="left"/>
+            </w:pPr>
+            <w:r>
+              <w:rPr>
+                <w:rFonts w:ascii="Times New Roman" w:hAnsi="Times New Roman"/>
+                <w:sz w:val="17"/>
+              </w:rPr>
+              <w:t xml:space="preserve">0.914 / 0.53</w:t>
+            </w:r>
+          </w:p>
+        </w:tc>
+        <w:tc>
+          <w:tcPr>
+            <w:tcBorders>
+              <w:bottom w:val="single" w:sz="10" w:color="000000"/>
+            </w:tcBorders>
+          </w:tcPr>
+          <w:p>
+            <w:pPr>
+              <w:pStyle w:val="Compact"/>
+              <w:spacing w:after="20" w:before="20" w:line="240" w:lineRule="auto"/>
+              <w:jc w:val="left"/>
+            </w:pPr>
+            <w:r>
+              <w:rPr>
+                <w:rFonts w:ascii="Times New Roman" w:hAnsi="Times New Roman"/>
+                <w:sz w:val="17"/>
+              </w:rPr>
+              <w:t xml:space="preserve">0.837 / 0.37</w:t>
+            </w:r>
+          </w:p>
+        </w:tc>
+        <w:tc>
+          <w:tcPr>
+            <w:tcBorders>
+              <w:bottom w:val="single" w:sz="10" w:color="000000"/>
+            </w:tcBorders>
+          </w:tcPr>
+          <w:p>
+            <w:pPr>
+              <w:pStyle w:val="Compact"/>
+              <w:spacing w:after="20" w:before="20" w:line="240" w:lineRule="auto"/>
+              <w:jc w:val="left"/>
+            </w:pPr>
+            <w:r>
+              <w:rPr>
+                <w:rFonts w:ascii="Times New Roman" w:hAnsi="Times New Roman"/>
+                <w:sz w:val="17"/>
+              </w:rPr>
+              <w:t xml:space="preserve">0.884 / 0.42</w:t>
+            </w:r>
+          </w:p>
+        </w:tc>
+      </w:tr>
+    </w:tbl>
+    <w:p>
+      <w:pPr>
+        <w:pStyle w:val="BodyText"/>
+      </w:pPr>
+      <w:r>
+        <w:t xml:space="preserve">Table 13 shows why. The rewrite</w:t>
+      </w:r>
+      <w:r>
+        <w:t xml:space="preserve"> </w:t>
+      </w:r>
+      <w:r>
+        <w:rPr>
+          <w:iCs/>
+          <w:i/>
+        </w:rPr>
+        <w:t xml:space="preserve">removed</w:t>
+      </w:r>
+      <w:r>
+        <w:t xml:space="preserve"> </w:t>
+      </w:r>
+      <w:r>
+        <w:t xml:space="preserve">parentheses, bracketed citations, semicolons, and passives, moving counts further from the human mean and not toward it. A generic paraphrase imposes the paraphraser’s habits, and these are not the habits of human scientific writers.</w:t>
+      </w:r>
+    </w:p>
+    <w:p>
+      <w:pPr>
+        <w:pStyle w:val="TableCaption"/>
+      </w:pPr>
+      <w:r>
+        <w:t xml:space="preserve">Table 13. Mean event count per 500-token window before and after the LLM rewrite, for four events.</w:t>
+      </w:r>
+    </w:p>
+    <w:tbl>
+      <w:tblPr>
+        <w:tblStyle w:val="Table"/>
+        <w:tblW w:type="pct" w:w="5000"/>
+        <w:tblLayout w:type="autofit"/>
+        <w:tblLook w:firstRow="1" w:lastRow="0" w:firstColumn="0" w:lastColumn="0" w:noHBand="0" w:noVBand="0" w:val="0020"/>
+        <w:jc w:val="start"/>
+        <w:tblCaption w:val="Table 13. Mean event count per 500-token window before and after the LLM rewrite, for four events."/>
+      </w:tblPr>
+      <w:tblGrid>
+        <w:gridCol w:w="1584"/>
+        <w:gridCol w:w="1584"/>
+        <w:gridCol w:w="1584"/>
+        <w:gridCol w:w="1584"/>
+        <w:gridCol w:w="1584"/>
+      </w:tblGrid>
+      <w:tr>
+        <w:trPr>
+          <w:tblHeader w:val="true"/>
+        </w:trPr>
+        <w:tc>
+          <w:tcPr>
+            <w:tcBorders>
+              <w:top w:val="single" w:sz="10" w:color="000000"/>
+              <w:bottom w:val="single" w:sz="6" w:color="000000"/>
+            </w:tcBorders>
+          </w:tcPr>
+          <w:p>
+            <w:pPr>
+              <w:pStyle w:val="Compact"/>
+              <w:spacing w:after="20" w:before="20" w:line="240" w:lineRule="auto"/>
+              <w:jc w:val="left"/>
+            </w:pPr>
+            <w:r>
+              <w:rPr>
+                <w:rFonts w:ascii="Times New Roman" w:hAnsi="Times New Roman"/>
+                <w:b/>
+                <w:sz w:val="17"/>
+              </w:rPr>
+              <w:t xml:space="preserve">Event</w:t>
+            </w:r>
+          </w:p>
+        </w:tc>
+        <w:tc>
+          <w:tcPr>
+            <w:tcBorders>
+              <w:top w:val="single" w:sz="10" w:color="000000"/>
+              <w:bottom w:val="single" w:sz="6" w:color="000000"/>
+            </w:tcBorders>
+          </w:tcPr>
+          <w:p>
+            <w:pPr>
+              <w:pStyle w:val="Compact"/>
+              <w:spacing w:after="20" w:before="20" w:line="240" w:lineRule="auto"/>
+              <w:jc w:val="right"/>
+            </w:pPr>
+            <w:r>
+              <w:rPr>
+                <w:rFonts w:ascii="Times New Roman" w:hAnsi="Times New Roman"/>
+                <w:b/>
+                <w:sz w:val="17"/>
+              </w:rPr>
+              <w:t xml:space="preserve">Human</w:t>
+            </w:r>
+          </w:p>
+        </w:tc>
+        <w:tc>
+          <w:tcPr>
+            <w:tcBorders>
+              <w:top w:val="single" w:sz="10" w:color="000000"/>
+              <w:bottom w:val="single" w:sz="6" w:color="000000"/>
+            </w:tcBorders>
+          </w:tcPr>
+          <w:p>
+            <w:pPr>
+              <w:pStyle w:val="Compact"/>
+              <w:spacing w:after="20" w:before="20" w:line="240" w:lineRule="auto"/>
+              <w:jc w:val="left"/>
+            </w:pPr>
+            <w:r>
+              <w:rPr>
+                <w:rFonts w:ascii="Times New Roman" w:hAnsi="Times New Roman"/>
+                <w:b/>
+                <w:sz w:val="17"/>
+              </w:rPr>
+              <w:t xml:space="preserve">GPT-4o: original → rewritten</w:t>
+            </w:r>
+          </w:p>
+        </w:tc>
+        <w:tc>
+          <w:tcPr>
+            <w:tcBorders>
+              <w:top w:val="single" w:sz="10" w:color="000000"/>
+              <w:bottom w:val="single" w:sz="6" w:color="000000"/>
+            </w:tcBorders>
+          </w:tcPr>
+          <w:p>
+            <w:pPr>
+              <w:pStyle w:val="Compact"/>
+              <w:spacing w:after="20" w:before="20" w:line="240" w:lineRule="auto"/>
+              <w:jc w:val="left"/>
+            </w:pPr>
+            <w:r>
+              <w:rPr>
+                <w:rFonts w:ascii="Times New Roman" w:hAnsi="Times New Roman"/>
+                <w:b/>
+                <w:sz w:val="17"/>
+              </w:rPr>
+              <w:t xml:space="preserve">Claude: original → rewritten</w:t>
+            </w:r>
+          </w:p>
+        </w:tc>
+        <w:tc>
+          <w:tcPr>
+            <w:tcBorders>
+              <w:top w:val="single" w:sz="10" w:color="000000"/>
+              <w:bottom w:val="single" w:sz="6" w:color="000000"/>
+            </w:tcBorders>
+          </w:tcPr>
+          <w:p>
+            <w:pPr>
+              <w:pStyle w:val="Compact"/>
+              <w:spacing w:after="20" w:before="20" w:line="240" w:lineRule="auto"/>
+              <w:jc w:val="left"/>
+            </w:pPr>
+            <w:r>
+              <w:rPr>
+                <w:rFonts w:ascii="Times New Roman" w:hAnsi="Times New Roman"/>
+                <w:b/>
+                <w:sz w:val="17"/>
+              </w:rPr>
+              <w:t xml:space="preserve">Llama: original → rewritten</w:t>
+            </w:r>
+          </w:p>
+        </w:tc>
+      </w:tr>
+      <w:tr>
+        <w:tc>
+          <w:tcPr/>
+          <w:p>
+            <w:pPr>
+              <w:pStyle w:val="Compact"/>
+              <w:spacing w:after="20" w:before="20" w:line="240" w:lineRule="auto"/>
+              <w:jc w:val="left"/>
+            </w:pPr>
+            <w:r>
+              <w:rPr>
+                <w:rFonts w:ascii="Times New Roman" w:hAnsi="Times New Roman"/>
+                <w:sz w:val="17"/>
+              </w:rPr>
+              <w:t xml:space="preserve">Parentheses</w:t>
+            </w:r>
+          </w:p>
+        </w:tc>
+        <w:tc>
+          <w:tcPr/>
+          <w:p>
+            <w:pPr>
+              <w:pStyle w:val="Compact"/>
+              <w:spacing w:after="20" w:before="20" w:line="240" w:lineRule="auto"/>
+              <w:jc w:val="right"/>
+            </w:pPr>
+            <w:r>
+              <w:rPr>
+                <w:rFonts w:ascii="Times New Roman" w:hAnsi="Times New Roman"/>
+                <w:sz w:val="17"/>
+              </w:rPr>
+              <w:t xml:space="preserve">9.80</w:t>
+            </w:r>
+          </w:p>
+        </w:tc>
+        <w:tc>
+          <w:tcPr/>
+          <w:p>
+            <w:pPr>
+              <w:pStyle w:val="Compact"/>
+              <w:spacing w:after="20" w:before="20" w:line="240" w:lineRule="auto"/>
+              <w:jc w:val="left"/>
+            </w:pPr>
+            <w:r>
+              <w:rPr>
+                <w:rFonts w:ascii="Times New Roman" w:hAnsi="Times New Roman"/>
+                <w:sz w:val="17"/>
+              </w:rPr>
+              <w:t xml:space="preserve">7.33 → 5.00</w:t>
+            </w:r>
+          </w:p>
+        </w:tc>
+        <w:tc>
+          <w:tcPr/>
+          <w:p>
+            <w:pPr>
+              <w:pStyle w:val="Compact"/>
+              <w:spacing w:after="20" w:before="20" w:line="240" w:lineRule="auto"/>
+              <w:jc w:val="left"/>
+            </w:pPr>
+            <w:r>
+              <w:rPr>
+                <w:rFonts w:ascii="Times New Roman" w:hAnsi="Times New Roman"/>
+                <w:sz w:val="17"/>
+              </w:rPr>
+              <w:t xml:space="preserve">11.38 → 5.72</w:t>
+            </w:r>
+          </w:p>
+        </w:tc>
+        <w:tc>
+          <w:tcPr/>
+          <w:p>
+            <w:pPr>
+              <w:pStyle w:val="Compact"/>
+              <w:spacing w:after="20" w:before="20" w:line="240" w:lineRule="auto"/>
+              <w:jc w:val="left"/>
+            </w:pPr>
+            <w:r>
+              <w:rPr>
+                <w:rFonts w:ascii="Times New Roman" w:hAnsi="Times New Roman"/>
+                <w:sz w:val="17"/>
+              </w:rPr>
+              <w:t xml:space="preserve">14.79 → 7.38</w:t>
+            </w:r>
+          </w:p>
+        </w:tc>
+      </w:tr>
+      <w:tr>
+        <w:tc>
+          <w:tcPr/>
+          <w:p>
+            <w:pPr>
+              <w:pStyle w:val="Compact"/>
+              <w:spacing w:after="20" w:before="20" w:line="240" w:lineRule="auto"/>
+              <w:jc w:val="left"/>
+            </w:pPr>
+            <w:r>
+              <w:rPr>
+                <w:rFonts w:ascii="Times New Roman" w:hAnsi="Times New Roman"/>
+                <w:sz w:val="17"/>
+              </w:rPr>
+              <w:t xml:space="preserve">Square brackets</w:t>
+            </w:r>
+          </w:p>
+        </w:tc>
+        <w:tc>
+          <w:tcPr/>
+          <w:p>
+            <w:pPr>
+              <w:pStyle w:val="Compact"/>
+              <w:spacing w:after="20" w:before="20" w:line="240" w:lineRule="auto"/>
+              <w:jc w:val="right"/>
+            </w:pPr>
+            <w:r>
+              <w:rPr>
+                <w:rFonts w:ascii="Times New Roman" w:hAnsi="Times New Roman"/>
+                <w:sz w:val="17"/>
+              </w:rPr>
+              <w:t xml:space="preserve">4.46</w:t>
+            </w:r>
+          </w:p>
+        </w:tc>
+        <w:tc>
+          <w:tcPr/>
+          <w:p>
+            <w:pPr>
+              <w:pStyle w:val="Compact"/>
+              <w:spacing w:after="20" w:before="20" w:line="240" w:lineRule="auto"/>
+              <w:jc w:val="left"/>
+            </w:pPr>
+            <w:r>
+              <w:rPr>
+                <w:rFonts w:ascii="Times New Roman" w:hAnsi="Times New Roman"/>
+                <w:sz w:val="17"/>
+              </w:rPr>
+              <w:t xml:space="preserve">0.23 → 0.06</w:t>
+            </w:r>
+          </w:p>
+        </w:tc>
+        <w:tc>
+          <w:tcPr/>
+          <w:p>
+            <w:pPr>
+              <w:pStyle w:val="Compact"/>
+              <w:spacing w:after="20" w:before="20" w:line="240" w:lineRule="auto"/>
+              <w:jc w:val="left"/>
+            </w:pPr>
+            <w:r>
+              <w:rPr>
+                <w:rFonts w:ascii="Times New Roman" w:hAnsi="Times New Roman"/>
+                <w:sz w:val="17"/>
+              </w:rPr>
+              <w:t xml:space="preserve">0.50 → 0.15</w:t>
+            </w:r>
+          </w:p>
+        </w:tc>
+        <w:tc>
+          <w:tcPr/>
+          <w:p>
+            <w:pPr>
+              <w:pStyle w:val="Compact"/>
+              <w:spacing w:after="20" w:before="20" w:line="240" w:lineRule="auto"/>
+              <w:jc w:val="left"/>
+            </w:pPr>
+            <w:r>
+              <w:rPr>
+                <w:rFonts w:ascii="Times New Roman" w:hAnsi="Times New Roman"/>
+                <w:sz w:val="17"/>
+              </w:rPr>
+              <w:t xml:space="preserve">0.12 → 0.02</w:t>
+            </w:r>
+          </w:p>
+        </w:tc>
+      </w:tr>
+      <w:tr>
+        <w:tc>
+          <w:tcPr/>
+          <w:p>
+            <w:pPr>
+              <w:pStyle w:val="Compact"/>
+              <w:spacing w:after="20" w:before="20" w:line="240" w:lineRule="auto"/>
+              <w:jc w:val="left"/>
+            </w:pPr>
+            <w:r>
+              <w:rPr>
+                <w:rFonts w:ascii="Times New Roman" w:hAnsi="Times New Roman"/>
+                <w:sz w:val="17"/>
+              </w:rPr>
+              <w:t xml:space="preserve">Semicolons</w:t>
+            </w:r>
+          </w:p>
+        </w:tc>
+        <w:tc>
+          <w:tcPr/>
+          <w:p>
+            <w:pPr>
+              <w:pStyle w:val="Compact"/>
+              <w:spacing w:after="20" w:before="20" w:line="240" w:lineRule="auto"/>
+              <w:jc w:val="right"/>
+            </w:pPr>
+            <w:r>
+              <w:rPr>
+                <w:rFonts w:ascii="Times New Roman" w:hAnsi="Times New Roman"/>
+                <w:sz w:val="17"/>
+              </w:rPr>
+              <w:t xml:space="preserve">1.95</w:t>
+            </w:r>
+          </w:p>
+        </w:tc>
+        <w:tc>
+          <w:tcPr/>
+          <w:p>
+            <w:pPr>
+              <w:pStyle w:val="Compact"/>
+              <w:spacing w:after="20" w:before="20" w:line="240" w:lineRule="auto"/>
+              <w:jc w:val="left"/>
+            </w:pPr>
+            <w:r>
+              <w:rPr>
+                <w:rFonts w:ascii="Times New Roman" w:hAnsi="Times New Roman"/>
+                <w:sz w:val="17"/>
+              </w:rPr>
+              <w:t xml:space="preserve">0.53 → 0.18</w:t>
+            </w:r>
+          </w:p>
+        </w:tc>
+        <w:tc>
+          <w:tcPr/>
+          <w:p>
+            <w:pPr>
+              <w:pStyle w:val="Compact"/>
+              <w:spacing w:after="20" w:before="20" w:line="240" w:lineRule="auto"/>
+              <w:jc w:val="left"/>
+            </w:pPr>
+            <w:r>
+              <w:rPr>
+                <w:rFonts w:ascii="Times New Roman" w:hAnsi="Times New Roman"/>
+                <w:sz w:val="17"/>
+              </w:rPr>
+              <w:t xml:space="preserve">3.54 → 1.53</w:t>
+            </w:r>
+          </w:p>
+        </w:tc>
+        <w:tc>
+          <w:tcPr/>
+          <w:p>
+            <w:pPr>
+              <w:pStyle w:val="Compact"/>
+              <w:spacing w:after="20" w:before="20" w:line="240" w:lineRule="auto"/>
+              <w:jc w:val="left"/>
+            </w:pPr>
+            <w:r>
+              <w:rPr>
+                <w:rFonts w:ascii="Times New Roman" w:hAnsi="Times New Roman"/>
+                <w:sz w:val="17"/>
+              </w:rPr>
+              <w:t xml:space="preserve">1.26 → 0.56</w:t>
+            </w:r>
+          </w:p>
+        </w:tc>
+      </w:tr>
+      <w:tr>
+        <w:tc>
+          <w:tcPr>
+            <w:tcBorders>
+              <w:bottom w:val="single" w:sz="10" w:color="000000"/>
+            </w:tcBorders>
+          </w:tcPr>
+          <w:p>
+            <w:pPr>
+              <w:pStyle w:val="Compact"/>
+              <w:spacing w:after="20" w:before="20" w:line="240" w:lineRule="auto"/>
+              <w:jc w:val="left"/>
+            </w:pPr>
+            <w:r>
+              <w:rPr>
+                <w:rFonts w:ascii="Times New Roman" w:hAnsi="Times New Roman"/>
+                <w:sz w:val="17"/>
+              </w:rPr>
+              <w:t xml:space="preserve">Passive constructions</w:t>
+            </w:r>
+          </w:p>
+        </w:tc>
+        <w:tc>
+          <w:tcPr>
+            <w:tcBorders>
+              <w:bottom w:val="single" w:sz="10" w:color="000000"/>
+            </w:tcBorders>
+          </w:tcPr>
+          <w:p>
+            <w:pPr>
+              <w:pStyle w:val="Compact"/>
+              <w:spacing w:after="20" w:before="20" w:line="240" w:lineRule="auto"/>
+              <w:jc w:val="right"/>
+            </w:pPr>
+            <w:r>
+              <w:rPr>
+                <w:rFonts w:ascii="Times New Roman" w:hAnsi="Times New Roman"/>
+                <w:sz w:val="17"/>
+              </w:rPr>
+              <w:t xml:space="preserve">8.08</w:t>
+            </w:r>
+          </w:p>
+        </w:tc>
+        <w:tc>
+          <w:tcPr>
+            <w:tcBorders>
+              <w:bottom w:val="single" w:sz="10" w:color="000000"/>
+            </w:tcBorders>
+          </w:tcPr>
+          <w:p>
+            <w:pPr>
+              <w:pStyle w:val="Compact"/>
+              <w:spacing w:after="20" w:before="20" w:line="240" w:lineRule="auto"/>
+              <w:jc w:val="left"/>
+            </w:pPr>
+            <w:r>
+              <w:rPr>
+                <w:rFonts w:ascii="Times New Roman" w:hAnsi="Times New Roman"/>
+                <w:sz w:val="17"/>
+              </w:rPr>
+              <w:t xml:space="preserve">6.31 → 5.38</w:t>
+            </w:r>
+          </w:p>
+        </w:tc>
+        <w:tc>
+          <w:tcPr>
+            <w:tcBorders>
+              <w:bottom w:val="single" w:sz="10" w:color="000000"/>
+            </w:tcBorders>
+          </w:tcPr>
+          <w:p>
+            <w:pPr>
+              <w:pStyle w:val="Compact"/>
+              <w:spacing w:after="20" w:before="20" w:line="240" w:lineRule="auto"/>
+              <w:jc w:val="left"/>
+            </w:pPr>
+            <w:r>
+              <w:rPr>
+                <w:rFonts w:ascii="Times New Roman" w:hAnsi="Times New Roman"/>
+                <w:sz w:val="17"/>
+              </w:rPr>
+              <w:t xml:space="preserve">8.71 → 6.76</w:t>
+            </w:r>
+          </w:p>
+        </w:tc>
+        <w:tc>
+          <w:tcPr>
+            <w:tcBorders>
+              <w:bottom w:val="single" w:sz="10" w:color="000000"/>
+            </w:tcBorders>
+          </w:tcPr>
+          <w:p>
+            <w:pPr>
+              <w:pStyle w:val="Compact"/>
+              <w:spacing w:after="20" w:before="20" w:line="240" w:lineRule="auto"/>
+              <w:jc w:val="left"/>
+            </w:pPr>
+            <w:r>
+              <w:rPr>
+                <w:rFonts w:ascii="Times New Roman" w:hAnsi="Times New Roman"/>
+                <w:sz w:val="17"/>
+              </w:rPr>
+              <w:t xml:space="preserve">6.47 → 5.57</w:t>
+            </w:r>
+          </w:p>
+        </w:tc>
+      </w:tr>
+    </w:tbl>
+    <w:p>
+      <w:pPr>
+        <w:pStyle w:val="BodyText"/>
+      </w:pPr>
+      <w:r>
+        <w:t xml:space="preserve">The two attacks together say that what matters for evasion is knowledge of the screen’s features, not rewriting power as such. An author who knows which events are counted can steer them, as the programmatic edit does, whereas an author who simply asks a model to sound human cannot. In the terms of the model, the generic rewrite is effort without effect, so d(e) does not fall and a rational author has no reason to use it, while the feature-aware edit has a steep d(e). Neither attacker is the strongest conceivable. A hybrid that rewrites the text and then adjusts the counted events was not tested, and neither were the judges on the rewritten papers.</w:t>
+      </w:r>
+    </w:p>
     <w:bookmarkEnd w:id="45"/>
     <w:bookmarkStart w:id="46" w:name="cost"/>
     <w:p>
@@ -8611,7 +9695,7 @@
         <w:pStyle w:val="BodyText"/>
       </w:pPr>
       <w:r>
-        <w:t xml:space="preserve">Third, a screen whose features are known is fragile. A crude edit of five easily changed events cut detection from 53% to 8%, and the model shows why this should be expected: when evasion is cheap relative to the stakes, equilibrium detection is far below the figure that non-adaptive authors would produce. The detectability paradox means that a very effective screen can provoke enough evasion to underperform a weaker one. Designing a screen therefore means choosing features that are costly to manipulate, not only features that discriminate. In our data, passives and nominalizations played that role, which echoes the economic logic that a signal is informative only to the extent that it is costly to fake (Spence 1973; Connelly et al. 2011). Because we publish our method, the relevant benchmark for any deployed version is the equilibrium detection rate, not the headline accuracy in this paper.</w:t>
+        <w:t xml:space="preserve">Third, a screen whose features are known is fragile. A crude edit of five easily changed events cut detection from 53% to 8%, whereas a generic LLM rewrite did not evade the screen and for one generator made detection easier, so the fragility lies in knowing the features and not in rewriting power as such. Publishing the features, as research does, supplies that knowledge. The model shows why the edit result should be expected: when evasion is cheap relative to the stakes, equilibrium detection is far below the figure that non-adaptive authors would produce. The detectability paradox means that a very effective screen can provoke enough evasion to underperform a weaker one. Designing a screen therefore means choosing features that are costly to manipulate, not only features that discriminate. In our data, passives and nominalizations played that role, which echoes the economic logic that a signal is informative only to the extent that it is costly to fake (Spence 1973; Connelly et al. 2011). Because we publish our method, the relevant benchmark for any deployed version is the equilibrium detection rate, not the headline accuracy in this paper.</w:t>
       </w:r>
     </w:p>
     <w:p>
@@ -8653,7 +9737,7 @@
         <w:pStyle w:val="BodyText"/>
       </w:pPr>
       <w:r>
-        <w:t xml:space="preserve">The economic model is simple. It assumes that investigating a flagged paper settles its status at a fixed cost, which is generous given that human reviewers often cannot distinguish machine text, and that capacity is unlimited. The costs of review and of a missed paper and the base rate are assumed, not measured, so the cost results are structural illustrations and not estimates for any organization. The judge’s operating point is fixed at a threshold of 50. The strategic extension considers a single decision by a single author, takes the base rate as given, and uses a quadratic cost of effort. The adversarial test is crude and programmatic; it is a lower bound on an adaptive author, who could paraphrase text with a language model, edit passives and nominalizations too, or optimize against the detector’s weights. The hard-to-edit feature set was chosen because our attack left it untouched, so its robustness is conditional on that attack. The judges were not attacked, and the programmatic edits would probably be noticed by a language-model judge or a human reader. We did not run MAUVE or BERTScore, we did not test paraphrased or lightly edited machine text, and we did not test whether explainable evidence improves human decisions.</w:t>
+        <w:t xml:space="preserve">The economic model is simple. It assumes that investigating a flagged paper settles its status at a fixed cost, which is generous given that human reviewers often cannot distinguish machine text, and that capacity is unlimited. The costs of review and of a missed paper and the base rate are assumed, not measured, so the cost results are structural illustrations and not estimates for any organization. The judge’s operating point is fixed at a threshold of 50. The strategic extension considers a single decision by a single author, takes the base rate as given, and uses a quadratic cost of effort. The programmatic adversarial test is crude; it is a lower bound on an adaptive author, who could edit passives and nominalizations too, or optimize against the detector’s weights. The generic LLM rewrite used a single attacker (Llama), a single prompt, and the clustering screen only, and a hybrid of rewriting and feature-aware editing was not tested. The hard-to-edit feature set was chosen because our attack left it untouched, so its robustness is conditional on that attack. The judges were not evaluated on the attacked papers, and the programmatic edits would probably be noticed by a language-model judge or a human reader. We did not run MAUVE or BERTScore, we did not test light human editing of machine text, and we did not test whether explainable evidence improves human decisions.</w:t>
       </w:r>
     </w:p>
     <w:p>
@@ -8661,7 +9745,7 @@
         <w:pStyle w:val="BodyText"/>
       </w:pPr>
       <w:r>
-        <w:t xml:space="preserve">Four steps would turn this pilot into a fuller test. The first is an attack in which a language model paraphrases machine papers to evade both the screen and the judges, which would test the strategic propositions against a stronger adversary. The second is to measure the parameters the model needs, with data on the base rate of machine-written submissions, on the cost of investigating a flag, and on the accuracy of human review, which would replace our illustrative values. The third is to add generators, especially open-weight models and future releases, and to replace the Poisson benchmark with a negative binomial reference and the moment estimator with a full likelihood. The fourth is a randomized experiment in which domain experts classify real and fabricated papers with and without an explainable indicator, which would test whether the transparency of count-based features improves decisions.</w:t>
+        <w:t xml:space="preserve">Four steps would turn this pilot into a fuller test. The first is a stronger adversary: a hybrid attack that rewrites machine papers with a language model and then adjusts the counted events, evaluated against both the screen and the judges, and with more than one attacker model. The second is to measure the parameters the model needs, with data on the base rate of machine-written submissions, on the cost of investigating a flag, and on the accuracy of human review, which would replace our illustrative values. The third is to add generators, especially open-weight models and future releases, and to replace the Poisson benchmark with a negative binomial reference and the moment estimator with a full likelihood. The fourth is a randomized experiment in which domain experts classify real and fabricated papers with and without an explainable indicator, which would test whether the transparency of count-based features improves decisions.</w:t>
       </w:r>
     </w:p>
     <w:bookmarkEnd w:id="49"/>
@@ -8679,7 +9763,7 @@
         <w:pStyle w:val="FirstParagraph"/>
       </w:pPr>
       <w:r>
-        <w:t xml:space="preserve">Whether to screen for machine-written scholarly text is an economic decision, and the value of a screen depends on three things that detection accuracy leaves out: the base rate of machine papers, the cost of false alarms and misses, and how authors respond. In a model of cascaded screening, a free statistical screen is worth most because it raises the base rate that an expensive judge sees, a judge with a blind spot is worth little, and a screen whose features are known can lose most of its power through evasion. Calibrated on three generators, the cheap screen detected machine papers well only within a generator, a strong LLM judge missed one generator almost completely, a simple cascade kept most of the judge’s detection at a fraction of its cost when machine papers were rare, and a crude feature-aware edit cut the screen’s detection from 53% to 8%. Organizations should therefore evaluate screens by their equilibrium performance against adapting authors, favor features that are costly to manipulate, and plan to maintain them. The evidence comes from three generators, one genre, and two judges, and a stronger adversary and measured cost parameters would be needed to turn these illustrations into estimates.</w:t>
+        <w:t xml:space="preserve">Whether to screen for machine-written scholarly text is an economic decision, and the value of a screen depends on three things that detection accuracy leaves out: the base rate of machine papers, the cost of false alarms and misses, and how authors respond. In a model of cascaded screening, a free statistical screen is worth most because it raises the base rate that an expensive judge sees, a judge with a blind spot is worth little, and a screen whose features are known can lose most of its power through evasion. Calibrated on three generators, the cheap screen detected machine papers well only within a generator, a strong LLM judge missed one generator almost completely, a simple cascade kept most of the judge’s detection at a fraction of its cost when machine papers were rare, and a crude feature-aware edit cut the screen’s detection from 53% to 8%, whereas a generic LLM rewrite did not evade it. Organizations should therefore evaluate screens by their equilibrium performance against adapting authors, favor features that are costly to manipulate, and plan to maintain them. The evidence comes from three generators, one genre, and two judges, and a stronger adversary and measured cost parameters would be needed to turn these illustrations into estimates.</w:t>
       </w:r>
     </w:p>
     <w:bookmarkEnd w:id="50"/>

</xml_diff>

<commit_message>
Add hybrid (rewrite + feature-aware edit) attack results; update paper
Co-Authored-By: Claude Sonnet 5.5 <noreply@anthropic.com>
Claude-Session: https://claude.ai/code/session_01FLb7uVf7YBgdoa75gbZ2sf
</commit_message>
<xml_diff>
--- a/paper/Screening_Economics_Paper.docx
+++ b/paper/Screening_Economics_Paper.docx
@@ -9642,7 +9642,615 @@
         <w:pStyle w:val="BodyText"/>
       </w:pPr>
       <w:r>
-        <w:t xml:space="preserve">The two attacks together say that what matters for evasion is knowledge of the screen’s features, not rewriting power as such. An author who knows which events are counted can steer them, as the programmatic edit does, whereas an author who simply asks a model to sound human cannot. In the terms of the model, the generic rewrite is effort without effect, so d(e) does not fall and a rational author has no reason to use it, while the feature-aware edit has a steep d(e). Neither attacker is the strongest conceivable. A hybrid that rewrites the text and then adjusts the counted events was not tested, and neither were the judges on the rewritten papers.</w:t>
+        <w:t xml:space="preserve">The two attacks together say that what matters for evasion is knowledge of the screen’s features, not rewriting power as such. An author who knows which events are counted can steer them, as the programmatic edit does, whereas an author who simply asks a model to sound human cannot. In the terms of the model, the generic rewrite is effort without effect, so d(e) does not fall and a rational author has no reason to use it, while the feature-aware edit has a steep d(e). A hybrid attack combines the two: the language model rewrites the paper, and the feature-aware edit is then applied to the rewritten text. It was no stronger than the edit alone (Table 14). Under full strength the mixture AUC was 0.681 under the standard protocol and 0.688 with Llama excluded, against 0.664 and 0.675 for the edit on the original papers, and the share detected at a 5% false-positive rate was 7% and 9% against 9% and 10%. The rewrite adds nothing beyond the edit: it helps slightly for GPT-4o papers (AUC 0.759 against 0.784 under the standard protocol) and hurts for Claude papers (0.561 against 0.481), because it moves their punctuation toward the paraphraser’s habits and so makes them easier to detect. A hybrid at half strength (e = 0.5) kept 12% to 13% of papers detectable. A residual of detection (AUC about 0.68) survives even the full hybrid, which comes from the events the attack leaves untouched, passives and nominalizations, and from the clustering structure of the others.</w:t>
+      </w:r>
+    </w:p>
+    <w:p>
+      <w:pPr>
+        <w:pStyle w:val="TableCaption"/>
+      </w:pPr>
+      <w:r>
+        <w:t xml:space="preserve">Table 14. Hybrid attack on the same 300 machine papers, with Llama (the rewriter) excluded from the screen’s training: AUC / share detected at a 5% false-positive rate. Under the standard protocol the mixture results are 0.885 / 0.54 (original), 0.914 / 0.53 (rewrite only), 0.664 / 0.09 (edit only), 0.742 / 0.12 (hybrid at e = 0.5), and 0.681 / 0.07 (hybrid at e = 1).</w:t>
+      </w:r>
+    </w:p>
+    <w:tbl>
+      <w:tblPr>
+        <w:tblStyle w:val="Table"/>
+        <w:tblW w:type="pct" w:w="5000"/>
+        <w:tblLayout w:type="autofit"/>
+        <w:tblLook w:firstRow="1" w:lastRow="0" w:firstColumn="0" w:lastColumn="0" w:noHBand="0" w:noVBand="0" w:val="0020"/>
+        <w:jc w:val="start"/>
+        <w:tblCaption w:val="Table 14. Hybrid attack on the same 300 machine papers, with Llama (the rewriter) excluded from the screen’s training: AUC / share detected at a 5% false-positive rate. Under the standard protocol the mixture results are 0.885 / 0.54 (original), 0.914 / 0.53 (rewrite only), 0.664 / 0.09 (edit only), 0.742 / 0.12 (hybrid at e = 0.5), and 0.681 / 0.07 (hybrid at e = 1)."/>
+      </w:tblPr>
+      <w:tblGrid>
+        <w:gridCol w:w="1584"/>
+        <w:gridCol w:w="1584"/>
+        <w:gridCol w:w="1584"/>
+        <w:gridCol w:w="1584"/>
+        <w:gridCol w:w="1584"/>
+      </w:tblGrid>
+      <w:tr>
+        <w:trPr>
+          <w:tblHeader w:val="true"/>
+        </w:trPr>
+        <w:tc>
+          <w:tcPr>
+            <w:tcBorders>
+              <w:top w:val="single" w:sz="10" w:color="000000"/>
+              <w:bottom w:val="single" w:sz="6" w:color="000000"/>
+            </w:tcBorders>
+          </w:tcPr>
+          <w:p>
+            <w:pPr>
+              <w:pStyle w:val="Compact"/>
+              <w:spacing w:after="20" w:before="20" w:line="240" w:lineRule="auto"/>
+              <w:jc w:val="left"/>
+            </w:pPr>
+            <w:r>
+              <w:rPr>
+                <w:rFonts w:ascii="Times New Roman" w:hAnsi="Times New Roman"/>
+                <w:b/>
+                <w:sz w:val="17"/>
+              </w:rPr>
+              <w:t xml:space="preserve">Condition</w:t>
+            </w:r>
+          </w:p>
+        </w:tc>
+        <w:tc>
+          <w:tcPr>
+            <w:tcBorders>
+              <w:top w:val="single" w:sz="10" w:color="000000"/>
+              <w:bottom w:val="single" w:sz="6" w:color="000000"/>
+            </w:tcBorders>
+          </w:tcPr>
+          <w:p>
+            <w:pPr>
+              <w:pStyle w:val="Compact"/>
+              <w:spacing w:after="20" w:before="20" w:line="240" w:lineRule="auto"/>
+              <w:jc w:val="left"/>
+            </w:pPr>
+            <w:r>
+              <w:rPr>
+                <w:rFonts w:ascii="Times New Roman" w:hAnsi="Times New Roman"/>
+                <w:b/>
+                <w:sz w:val="17"/>
+              </w:rPr>
+              <w:t xml:space="preserve">GPT-4o</w:t>
+            </w:r>
+          </w:p>
+        </w:tc>
+        <w:tc>
+          <w:tcPr>
+            <w:tcBorders>
+              <w:top w:val="single" w:sz="10" w:color="000000"/>
+              <w:bottom w:val="single" w:sz="6" w:color="000000"/>
+            </w:tcBorders>
+          </w:tcPr>
+          <w:p>
+            <w:pPr>
+              <w:pStyle w:val="Compact"/>
+              <w:spacing w:after="20" w:before="20" w:line="240" w:lineRule="auto"/>
+              <w:jc w:val="left"/>
+            </w:pPr>
+            <w:r>
+              <w:rPr>
+                <w:rFonts w:ascii="Times New Roman" w:hAnsi="Times New Roman"/>
+                <w:b/>
+                <w:sz w:val="17"/>
+              </w:rPr>
+              <w:t xml:space="preserve">Claude</w:t>
+            </w:r>
+          </w:p>
+        </w:tc>
+        <w:tc>
+          <w:tcPr>
+            <w:tcBorders>
+              <w:top w:val="single" w:sz="10" w:color="000000"/>
+              <w:bottom w:val="single" w:sz="6" w:color="000000"/>
+            </w:tcBorders>
+          </w:tcPr>
+          <w:p>
+            <w:pPr>
+              <w:pStyle w:val="Compact"/>
+              <w:spacing w:after="20" w:before="20" w:line="240" w:lineRule="auto"/>
+              <w:jc w:val="left"/>
+            </w:pPr>
+            <w:r>
+              <w:rPr>
+                <w:rFonts w:ascii="Times New Roman" w:hAnsi="Times New Roman"/>
+                <w:b/>
+                <w:sz w:val="17"/>
+              </w:rPr>
+              <w:t xml:space="preserve">Llama</w:t>
+            </w:r>
+          </w:p>
+        </w:tc>
+        <w:tc>
+          <w:tcPr>
+            <w:tcBorders>
+              <w:top w:val="single" w:sz="10" w:color="000000"/>
+              <w:bottom w:val="single" w:sz="6" w:color="000000"/>
+            </w:tcBorders>
+          </w:tcPr>
+          <w:p>
+            <w:pPr>
+              <w:pStyle w:val="Compact"/>
+              <w:spacing w:after="20" w:before="20" w:line="240" w:lineRule="auto"/>
+              <w:jc w:val="left"/>
+            </w:pPr>
+            <w:r>
+              <w:rPr>
+                <w:rFonts w:ascii="Times New Roman" w:hAnsi="Times New Roman"/>
+                <w:b/>
+                <w:sz w:val="17"/>
+              </w:rPr>
+              <w:t xml:space="preserve">Mixture</w:t>
+            </w:r>
+          </w:p>
+        </w:tc>
+      </w:tr>
+      <w:tr>
+        <w:tc>
+          <w:tcPr/>
+          <w:p>
+            <w:pPr>
+              <w:pStyle w:val="Compact"/>
+              <w:spacing w:after="20" w:before="20" w:line="240" w:lineRule="auto"/>
+              <w:jc w:val="left"/>
+            </w:pPr>
+            <w:r>
+              <w:rPr>
+                <w:rFonts w:ascii="Times New Roman" w:hAnsi="Times New Roman"/>
+                <w:sz w:val="17"/>
+              </w:rPr>
+              <w:t xml:space="preserve">Original (no attack)</w:t>
+            </w:r>
+          </w:p>
+        </w:tc>
+        <w:tc>
+          <w:tcPr/>
+          <w:p>
+            <w:pPr>
+              <w:pStyle w:val="Compact"/>
+              <w:spacing w:after="20" w:before="20" w:line="240" w:lineRule="auto"/>
+              <w:jc w:val="left"/>
+            </w:pPr>
+            <w:r>
+              <w:rPr>
+                <w:rFonts w:ascii="Times New Roman" w:hAnsi="Times New Roman"/>
+                <w:sz w:val="17"/>
+              </w:rPr>
+              <w:t xml:space="preserve">0.830 / 0.20</w:t>
+            </w:r>
+          </w:p>
+        </w:tc>
+        <w:tc>
+          <w:tcPr/>
+          <w:p>
+            <w:pPr>
+              <w:pStyle w:val="Compact"/>
+              <w:spacing w:after="20" w:before="20" w:line="240" w:lineRule="auto"/>
+              <w:jc w:val="left"/>
+            </w:pPr>
+            <w:r>
+              <w:rPr>
+                <w:rFonts w:ascii="Times New Roman" w:hAnsi="Times New Roman"/>
+                <w:sz w:val="17"/>
+              </w:rPr>
+              <w:t xml:space="preserve">0.750 / 0.21</w:t>
+            </w:r>
+          </w:p>
+        </w:tc>
+        <w:tc>
+          <w:tcPr/>
+          <w:p>
+            <w:pPr>
+              <w:pStyle w:val="Compact"/>
+              <w:spacing w:after="20" w:before="20" w:line="240" w:lineRule="auto"/>
+              <w:jc w:val="left"/>
+            </w:pPr>
+            <w:r>
+              <w:rPr>
+                <w:rFonts w:ascii="Times New Roman" w:hAnsi="Times New Roman"/>
+                <w:sz w:val="17"/>
+              </w:rPr>
+              <w:t xml:space="preserve">0.932 / 0.70</w:t>
+            </w:r>
+          </w:p>
+        </w:tc>
+        <w:tc>
+          <w:tcPr/>
+          <w:p>
+            <w:pPr>
+              <w:pStyle w:val="Compact"/>
+              <w:spacing w:after="20" w:before="20" w:line="240" w:lineRule="auto"/>
+              <w:jc w:val="left"/>
+            </w:pPr>
+            <w:r>
+              <w:rPr>
+                <w:rFonts w:ascii="Times New Roman" w:hAnsi="Times New Roman"/>
+                <w:sz w:val="17"/>
+              </w:rPr>
+              <w:t xml:space="preserve">0.837 / 0.37</w:t>
+            </w:r>
+          </w:p>
+        </w:tc>
+      </w:tr>
+      <w:tr>
+        <w:tc>
+          <w:tcPr/>
+          <w:p>
+            <w:pPr>
+              <w:pStyle w:val="Compact"/>
+              <w:spacing w:after="20" w:before="20" w:line="240" w:lineRule="auto"/>
+              <w:jc w:val="left"/>
+            </w:pPr>
+            <w:r>
+              <w:rPr>
+                <w:rFonts w:ascii="Times New Roman" w:hAnsi="Times New Roman"/>
+                <w:sz w:val="17"/>
+              </w:rPr>
+              <w:t xml:space="preserve">Rewrite only</w:t>
+            </w:r>
+          </w:p>
+        </w:tc>
+        <w:tc>
+          <w:tcPr/>
+          <w:p>
+            <w:pPr>
+              <w:pStyle w:val="Compact"/>
+              <w:spacing w:after="20" w:before="20" w:line="240" w:lineRule="auto"/>
+              <w:jc w:val="left"/>
+            </w:pPr>
+            <w:r>
+              <w:rPr>
+                <w:rFonts w:ascii="Times New Roman" w:hAnsi="Times New Roman"/>
+                <w:sz w:val="17"/>
+              </w:rPr>
+              <w:t xml:space="preserve">0.813 / 0.11</w:t>
+            </w:r>
+          </w:p>
+        </w:tc>
+        <w:tc>
+          <w:tcPr/>
+          <w:p>
+            <w:pPr>
+              <w:pStyle w:val="Compact"/>
+              <w:spacing w:after="20" w:before="20" w:line="240" w:lineRule="auto"/>
+              <w:jc w:val="left"/>
+            </w:pPr>
+            <w:r>
+              <w:rPr>
+                <w:rFonts w:ascii="Times New Roman" w:hAnsi="Times New Roman"/>
+                <w:sz w:val="17"/>
+              </w:rPr>
+              <w:t xml:space="preserve">0.905 / 0.51</w:t>
+            </w:r>
+          </w:p>
+        </w:tc>
+        <w:tc>
+          <w:tcPr/>
+          <w:p>
+            <w:pPr>
+              <w:pStyle w:val="Compact"/>
+              <w:spacing w:after="20" w:before="20" w:line="240" w:lineRule="auto"/>
+              <w:jc w:val="left"/>
+            </w:pPr>
+            <w:r>
+              <w:rPr>
+                <w:rFonts w:ascii="Times New Roman" w:hAnsi="Times New Roman"/>
+                <w:sz w:val="17"/>
+              </w:rPr>
+              <w:t xml:space="preserve">0.935 / 0.63</w:t>
+            </w:r>
+          </w:p>
+        </w:tc>
+        <w:tc>
+          <w:tcPr/>
+          <w:p>
+            <w:pPr>
+              <w:pStyle w:val="Compact"/>
+              <w:spacing w:after="20" w:before="20" w:line="240" w:lineRule="auto"/>
+              <w:jc w:val="left"/>
+            </w:pPr>
+            <w:r>
+              <w:rPr>
+                <w:rFonts w:ascii="Times New Roman" w:hAnsi="Times New Roman"/>
+                <w:sz w:val="17"/>
+              </w:rPr>
+              <w:t xml:space="preserve">0.884 / 0.42</w:t>
+            </w:r>
+          </w:p>
+        </w:tc>
+      </w:tr>
+      <w:tr>
+        <w:tc>
+          <w:tcPr/>
+          <w:p>
+            <w:pPr>
+              <w:pStyle w:val="Compact"/>
+              <w:spacing w:after="20" w:before="20" w:line="240" w:lineRule="auto"/>
+              <w:jc w:val="left"/>
+            </w:pPr>
+            <w:r>
+              <w:rPr>
+                <w:rFonts w:ascii="Times New Roman" w:hAnsi="Times New Roman"/>
+                <w:sz w:val="17"/>
+              </w:rPr>
+              <w:t xml:space="preserve">Feature-aware edit only (e = 1)</w:t>
+            </w:r>
+          </w:p>
+        </w:tc>
+        <w:tc>
+          <w:tcPr/>
+          <w:p>
+            <w:pPr>
+              <w:pStyle w:val="Compact"/>
+              <w:spacing w:after="20" w:before="20" w:line="240" w:lineRule="auto"/>
+              <w:jc w:val="left"/>
+            </w:pPr>
+            <w:r>
+              <w:rPr>
+                <w:rFonts w:ascii="Times New Roman" w:hAnsi="Times New Roman"/>
+                <w:sz w:val="17"/>
+              </w:rPr>
+              <w:t xml:space="preserve">0.804 / 0.13</w:t>
+            </w:r>
+          </w:p>
+        </w:tc>
+        <w:tc>
+          <w:tcPr/>
+          <w:p>
+            <w:pPr>
+              <w:pStyle w:val="Compact"/>
+              <w:spacing w:after="20" w:before="20" w:line="240" w:lineRule="auto"/>
+              <w:jc w:val="left"/>
+            </w:pPr>
+            <w:r>
+              <w:rPr>
+                <w:rFonts w:ascii="Times New Roman" w:hAnsi="Times New Roman"/>
+                <w:sz w:val="17"/>
+              </w:rPr>
+              <w:t xml:space="preserve">0.495 / 0.03</w:t>
+            </w:r>
+          </w:p>
+        </w:tc>
+        <w:tc>
+          <w:tcPr/>
+          <w:p>
+            <w:pPr>
+              <w:pStyle w:val="Compact"/>
+              <w:spacing w:after="20" w:before="20" w:line="240" w:lineRule="auto"/>
+              <w:jc w:val="left"/>
+            </w:pPr>
+            <w:r>
+              <w:rPr>
+                <w:rFonts w:ascii="Times New Roman" w:hAnsi="Times New Roman"/>
+                <w:sz w:val="17"/>
+              </w:rPr>
+              <w:t xml:space="preserve">0.727 / 0.13</w:t>
+            </w:r>
+          </w:p>
+        </w:tc>
+        <w:tc>
+          <w:tcPr/>
+          <w:p>
+            <w:pPr>
+              <w:pStyle w:val="Compact"/>
+              <w:spacing w:after="20" w:before="20" w:line="240" w:lineRule="auto"/>
+              <w:jc w:val="left"/>
+            </w:pPr>
+            <w:r>
+              <w:rPr>
+                <w:rFonts w:ascii="Times New Roman" w:hAnsi="Times New Roman"/>
+                <w:sz w:val="17"/>
+              </w:rPr>
+              <w:t xml:space="preserve">0.675 / 0.10</w:t>
+            </w:r>
+          </w:p>
+        </w:tc>
+      </w:tr>
+      <w:tr>
+        <w:tc>
+          <w:tcPr/>
+          <w:p>
+            <w:pPr>
+              <w:pStyle w:val="Compact"/>
+              <w:spacing w:after="20" w:before="20" w:line="240" w:lineRule="auto"/>
+              <w:jc w:val="left"/>
+            </w:pPr>
+            <w:r>
+              <w:rPr>
+                <w:rFonts w:ascii="Times New Roman" w:hAnsi="Times New Roman"/>
+                <w:sz w:val="17"/>
+              </w:rPr>
+              <w:t xml:space="preserve">Rewrite, then edit (e = 0.5)</w:t>
+            </w:r>
+          </w:p>
+        </w:tc>
+        <w:tc>
+          <w:tcPr/>
+          <w:p>
+            <w:pPr>
+              <w:pStyle w:val="Compact"/>
+              <w:spacing w:after="20" w:before="20" w:line="240" w:lineRule="auto"/>
+              <w:jc w:val="left"/>
+            </w:pPr>
+            <w:r>
+              <w:rPr>
+                <w:rFonts w:ascii="Times New Roman" w:hAnsi="Times New Roman"/>
+                <w:sz w:val="17"/>
+              </w:rPr>
+              <w:t xml:space="preserve">0.770 / 0.10</w:t>
+            </w:r>
+          </w:p>
+        </w:tc>
+        <w:tc>
+          <w:tcPr/>
+          <w:p>
+            <w:pPr>
+              <w:pStyle w:val="Compact"/>
+              <w:spacing w:after="20" w:before="20" w:line="240" w:lineRule="auto"/>
+              <w:jc w:val="left"/>
+            </w:pPr>
+            <w:r>
+              <w:rPr>
+                <w:rFonts w:ascii="Times New Roman" w:hAnsi="Times New Roman"/>
+                <w:sz w:val="17"/>
+              </w:rPr>
+              <w:t xml:space="preserve">0.674 / 0.09</w:t>
+            </w:r>
+          </w:p>
+        </w:tc>
+        <w:tc>
+          <w:tcPr/>
+          <w:p>
+            <w:pPr>
+              <w:pStyle w:val="Compact"/>
+              <w:spacing w:after="20" w:before="20" w:line="240" w:lineRule="auto"/>
+              <w:jc w:val="left"/>
+            </w:pPr>
+            <w:r>
+              <w:rPr>
+                <w:rFonts w:ascii="Times New Roman" w:hAnsi="Times New Roman"/>
+                <w:sz w:val="17"/>
+              </w:rPr>
+              <w:t xml:space="preserve">0.782 / 0.21</w:t>
+            </w:r>
+          </w:p>
+        </w:tc>
+        <w:tc>
+          <w:tcPr/>
+          <w:p>
+            <w:pPr>
+              <w:pStyle w:val="Compact"/>
+              <w:spacing w:after="20" w:before="20" w:line="240" w:lineRule="auto"/>
+              <w:jc w:val="left"/>
+            </w:pPr>
+            <w:r>
+              <w:rPr>
+                <w:rFonts w:ascii="Times New Roman" w:hAnsi="Times New Roman"/>
+                <w:sz w:val="17"/>
+              </w:rPr>
+              <w:t xml:space="preserve">0.742 / 0.13</w:t>
+            </w:r>
+          </w:p>
+        </w:tc>
+      </w:tr>
+      <w:tr>
+        <w:tc>
+          <w:tcPr>
+            <w:tcBorders>
+              <w:bottom w:val="single" w:sz="10" w:color="000000"/>
+            </w:tcBorders>
+          </w:tcPr>
+          <w:p>
+            <w:pPr>
+              <w:pStyle w:val="Compact"/>
+              <w:spacing w:after="20" w:before="20" w:line="240" w:lineRule="auto"/>
+              <w:jc w:val="left"/>
+            </w:pPr>
+            <w:r>
+              <w:rPr>
+                <w:rFonts w:ascii="Times New Roman" w:hAnsi="Times New Roman"/>
+                <w:sz w:val="17"/>
+              </w:rPr>
+              <w:t xml:space="preserve">Rewrite, then edit (e = 1)</w:t>
+            </w:r>
+          </w:p>
+        </w:tc>
+        <w:tc>
+          <w:tcPr>
+            <w:tcBorders>
+              <w:bottom w:val="single" w:sz="10" w:color="000000"/>
+            </w:tcBorders>
+          </w:tcPr>
+          <w:p>
+            <w:pPr>
+              <w:pStyle w:val="Compact"/>
+              <w:spacing w:after="20" w:before="20" w:line="240" w:lineRule="auto"/>
+              <w:jc w:val="left"/>
+            </w:pPr>
+            <w:r>
+              <w:rPr>
+                <w:rFonts w:ascii="Times New Roman" w:hAnsi="Times New Roman"/>
+                <w:sz w:val="17"/>
+              </w:rPr>
+              <w:t xml:space="preserve">0.800 / 0.10</w:t>
+            </w:r>
+          </w:p>
+        </w:tc>
+        <w:tc>
+          <w:tcPr>
+            <w:tcBorders>
+              <w:bottom w:val="single" w:sz="10" w:color="000000"/>
+            </w:tcBorders>
+          </w:tcPr>
+          <w:p>
+            <w:pPr>
+              <w:pStyle w:val="Compact"/>
+              <w:spacing w:after="20" w:before="20" w:line="240" w:lineRule="auto"/>
+              <w:jc w:val="left"/>
+            </w:pPr>
+            <w:r>
+              <w:rPr>
+                <w:rFonts w:ascii="Times New Roman" w:hAnsi="Times New Roman"/>
+                <w:sz w:val="17"/>
+              </w:rPr>
+              <w:t xml:space="preserve">0.541 / 0.03</w:t>
+            </w:r>
+          </w:p>
+        </w:tc>
+        <w:tc>
+          <w:tcPr>
+            <w:tcBorders>
+              <w:bottom w:val="single" w:sz="10" w:color="000000"/>
+            </w:tcBorders>
+          </w:tcPr>
+          <w:p>
+            <w:pPr>
+              <w:pStyle w:val="Compact"/>
+              <w:spacing w:after="20" w:before="20" w:line="240" w:lineRule="auto"/>
+              <w:jc w:val="left"/>
+            </w:pPr>
+            <w:r>
+              <w:rPr>
+                <w:rFonts w:ascii="Times New Roman" w:hAnsi="Times New Roman"/>
+                <w:sz w:val="17"/>
+              </w:rPr>
+              <w:t xml:space="preserve">0.723 / 0.13</w:t>
+            </w:r>
+          </w:p>
+        </w:tc>
+        <w:tc>
+          <w:tcPr>
+            <w:tcBorders>
+              <w:bottom w:val="single" w:sz="10" w:color="000000"/>
+            </w:tcBorders>
+          </w:tcPr>
+          <w:p>
+            <w:pPr>
+              <w:pStyle w:val="Compact"/>
+              <w:spacing w:after="20" w:before="20" w:line="240" w:lineRule="auto"/>
+              <w:jc w:val="left"/>
+            </w:pPr>
+            <w:r>
+              <w:rPr>
+                <w:rFonts w:ascii="Times New Roman" w:hAnsi="Times New Roman"/>
+                <w:sz w:val="17"/>
+              </w:rPr>
+              <w:t xml:space="preserve">0.688 / 0.09</w:t>
+            </w:r>
+          </w:p>
+        </w:tc>
+      </w:tr>
+    </w:tbl>
+    <w:p>
+      <w:pPr>
+        <w:pStyle w:val="BodyText"/>
+      </w:pPr>
+      <w:r>
+        <w:t xml:space="preserve">None of the attackers is the strongest conceivable. The edit leaves passives and nominalizations alone, and none of the attacks optimizes against the detector’s weights. The judges were not evaluated on the attacked papers.</w:t>
       </w:r>
     </w:p>
     <w:bookmarkEnd w:id="45"/>
@@ -9737,7 +10345,7 @@
         <w:pStyle w:val="BodyText"/>
       </w:pPr>
       <w:r>
-        <w:t xml:space="preserve">The economic model is simple. It assumes that investigating a flagged paper settles its status at a fixed cost, which is generous given that human reviewers often cannot distinguish machine text, and that capacity is unlimited. The costs of review and of a missed paper and the base rate are assumed, not measured, so the cost results are structural illustrations and not estimates for any organization. The judge’s operating point is fixed at a threshold of 50. The strategic extension considers a single decision by a single author, takes the base rate as given, and uses a quadratic cost of effort. The programmatic adversarial test is crude; it is a lower bound on an adaptive author, who could edit passives and nominalizations too, or optimize against the detector’s weights. The generic LLM rewrite used a single attacker (Llama), a single prompt, and the clustering screen only, and a hybrid of rewriting and feature-aware editing was not tested. The hard-to-edit feature set was chosen because our attack left it untouched, so its robustness is conditional on that attack. The judges were not evaluated on the attacked papers, and the programmatic edits would probably be noticed by a language-model judge or a human reader. We did not run MAUVE or BERTScore, we did not test light human editing of machine text, and we did not test whether explainable evidence improves human decisions.</w:t>
+        <w:t xml:space="preserve">The economic model is simple. It assumes that investigating a flagged paper settles its status at a fixed cost, which is generous given that human reviewers often cannot distinguish machine text, and that capacity is unlimited. The costs of review and of a missed paper and the base rate are assumed, not measured, so the cost results are structural illustrations and not estimates for any organization. The judge’s operating point is fixed at a threshold of 50. The strategic extension considers a single decision by a single author, takes the base rate as given, and uses a quadratic cost of effort. The programmatic adversarial test is crude; it is a lower bound on an adaptive author, who could edit passives and nominalizations too, or optimize against the detector’s weights. The generic LLM rewrite used a single attacker (Llama), a single prompt, and the clustering screen only. The hybrid of rewriting and feature-aware editing was no stronger than the edit alone, but neither attack edits passives and nominalizations or optimizes against the detector’s weights, so an adaptive author could do better than any of our attacks. The hard-to-edit feature set was chosen because our attack left it untouched, so its robustness is conditional on that attack. The judges were not evaluated on the attacked papers, and the programmatic edits would probably be noticed by a language-model judge or a human reader. We did not run MAUVE or BERTScore, we did not test light human editing of machine text, and we did not test whether explainable evidence improves human decisions.</w:t>
       </w:r>
     </w:p>
     <w:p>
@@ -9745,7 +10353,7 @@
         <w:pStyle w:val="BodyText"/>
       </w:pPr>
       <w:r>
-        <w:t xml:space="preserve">Four steps would turn this pilot into a fuller test. The first is a stronger adversary: a hybrid attack that rewrites machine papers with a language model and then adjusts the counted events, evaluated against both the screen and the judges, and with more than one attacker model. The second is to measure the parameters the model needs, with data on the base rate of machine-written submissions, on the cost of investigating a flag, and on the accuracy of human review, which would replace our illustrative values. The third is to add generators, especially open-weight models and future releases, and to replace the Poisson benchmark with a negative binomial reference and the moment estimator with a full likelihood. The fourth is a randomized experiment in which domain experts classify real and fabricated papers with and without an explainable indicator, which would test whether the transparency of count-based features improves decisions.</w:t>
+        <w:t xml:space="preserve">Four steps would turn this pilot into a fuller test. The first is a stronger adversary: an attack that also edits passives and nominalizations or optimizes against the detector’s weights, evaluated against both the screen and the judges, and with more than one attacker model. The second is to measure the parameters the model needs, with data on the base rate of machine-written submissions, on the cost of investigating a flag, and on the accuracy of human review, which would replace our illustrative values. The third is to add generators, especially open-weight models and future releases, and to replace the Poisson benchmark with a negative binomial reference and the moment estimator with a full likelihood. The fourth is a randomized experiment in which domain experts classify real and fabricated papers with and without an explainable indicator, which would test whether the transparency of count-based features improves decisions.</w:t>
       </w:r>
     </w:p>
     <w:bookmarkEnd w:id="49"/>

</xml_diff>

<commit_message>
Add judge-under-attack and cascade-under-attack results; update paper
Co-Authored-By: Claude Sonnet 5.5 <noreply@anthropic.com>
Claude-Session: https://claude.ai/code/session_01FLb7uVf7YBgdoa75gbZ2sf
</commit_message>
<xml_diff>
--- a/paper/Screening_Economics_Paper.docx
+++ b/paper/Screening_Economics_Paper.docx
@@ -212,7 +212,7 @@
         <w:pStyle w:val="FirstParagraph"/>
       </w:pPr>
       <w:r>
-        <w:t xml:space="preserve">Publishers must decide how much to spend screening documents for machine authorship, yet detection research ignores costs, base rates, and adaptive authors. We develop a decision model of a two-stage screen, in which a free screen decides which documents reach a costly LLM judge, and extend it to authors who choose how hard to evade. The model implies that the screen mainly raises the base rate the judge sees, that a judge with a blind spot is not worth calling, and that a publicly known screen can lose most of its power. We calibrate the model with 474 human papers and papers from GPT-4o, Claude, and Llama. A count-based screen detects machine papers well only within a generator, a strong judge misses Claude, a cascade keeps most detection at lower cost, and a feature-aware edit cuts detection from 53% to 8%, whereas a generic LLM rewrite does not evade it.</w:t>
+        <w:t xml:space="preserve">Publishers must decide how much to spend screening documents for machine authorship, yet detection research ignores costs, base rates, and adaptive authors. We develop a decision model of a two-stage screen, in which a free screen decides which documents reach an LLM judge, and extend it to authors who choose how hard to evade. It implies that the screen mainly raises the base rate the judge sees, that a judge with a blind spot is not worth calling, and that a publicly known screen can lose most of its power. We calibrate it with 474 human papers and papers from GPT-4o, Claude, and Llama. A count-based screen detects machine papers well only within a generator, and a strong judge misses Claude. A cascade keeps most detection at lower cost, but a feature-aware edit cuts the screen’s detection from 53% to 8%, weakens the cascade, and does not fool the judge.</w:t>
       </w:r>
     </w:p>
     <w:p>
@@ -10250,9 +10250,1479 @@
         <w:pStyle w:val="BodyText"/>
       </w:pPr>
       <w:r>
-        <w:t xml:space="preserve">None of the attackers is the strongest conceivable. The edit leaves passives and nominalizations alone, and none of the attacks optimizes against the detector’s weights. The judges were not evaluated on the attacked papers.</w:t>
+        <w:t xml:space="preserve">None of the attackers is the strongest conceivable. The edit leaves passives and nominalizations alone, and none of the attacks optimizes against the detector’s weights.</w:t>
       </w:r>
     </w:p>
+    <w:p>
+      <w:pPr>
+        <w:pStyle w:val="BodyText"/>
+      </w:pPr>
+      <w:r>
+        <w:t xml:space="preserve">We then gave the Gemini judge the hybrid-attacked papers (the 300 machine papers, rewritten and then edited, in their first 2,000 tokens; US$5.46 in judge calls). The judge was not fooled (Table 15). Its AUC stayed at 0.975 for GPT-4o papers, rose slightly for Llama papers (0.974 to 0.985), and rose clearly for Claude papers (0.656 to 0.840, with the share detected at a 5% false-positive rate going from 0.01 to 0.35), while the screen’s AUC on the same papers fell from 0.746 to 0.536 for Claude and from 0.929 to 0.724 for Llama. We cannot say whether the improvement for Claude comes from the edit or from the rewrite: the judge saw text rewritten by Llama, whose style the judge may recognize as machine-like, and we did not give the judge the edit-only or rewrite-only papers. What the result does show is that a hybrid attack that defeats the count-based screen does not defeat this judge.</w:t>
+      </w:r>
+    </w:p>
+    <w:p>
+      <w:pPr>
+        <w:pStyle w:val="TableCaption"/>
+      </w:pPr>
+      <w:r>
+        <w:t xml:space="preserve">Table 15. The screen, the Gemini judge, and their rank-average fusion before and after the hybrid attack: AUC / share of machine papers detected at a 5% false-positive rate. The screen here is trained without the target generator and without Llama (the rewriter), so its original-text values differ from those in Tables 5 and 6, which include Llama in training.</w:t>
+      </w:r>
+    </w:p>
+    <w:tbl>
+      <w:tblPr>
+        <w:tblStyle w:val="Table"/>
+        <w:tblW w:type="pct" w:w="5000"/>
+        <w:tblLayout w:type="autofit"/>
+        <w:tblLook w:firstRow="1" w:lastRow="0" w:firstColumn="0" w:lastColumn="0" w:noHBand="0" w:noVBand="0" w:val="0020"/>
+        <w:jc w:val="start"/>
+        <w:tblCaption w:val="Table 15. The screen, the Gemini judge, and their rank-average fusion before and after the hybrid attack: AUC / share of machine papers detected at a 5% false-positive rate. The screen here is trained without the target generator and without Llama (the rewriter), so its original-text values differ from those in Tables 5 and 6, which include Llama in training."/>
+      </w:tblPr>
+      <w:tblGrid>
+        <w:gridCol w:w="1584"/>
+        <w:gridCol w:w="1584"/>
+        <w:gridCol w:w="1584"/>
+        <w:gridCol w:w="1584"/>
+        <w:gridCol w:w="1584"/>
+      </w:tblGrid>
+      <w:tr>
+        <w:trPr>
+          <w:tblHeader w:val="true"/>
+        </w:trPr>
+        <w:tc>
+          <w:tcPr>
+            <w:tcBorders>
+              <w:top w:val="single" w:sz="10" w:color="000000"/>
+              <w:bottom w:val="single" w:sz="6" w:color="000000"/>
+            </w:tcBorders>
+          </w:tcPr>
+          <w:p>
+            <w:pPr>
+              <w:pStyle w:val="Compact"/>
+              <w:spacing w:after="20" w:before="20" w:line="240" w:lineRule="auto"/>
+              <w:jc w:val="left"/>
+            </w:pPr>
+            <w:r>
+              <w:rPr>
+                <w:rFonts w:ascii="Times New Roman" w:hAnsi="Times New Roman"/>
+                <w:b/>
+                <w:sz w:val="17"/>
+              </w:rPr>
+              <w:t xml:space="preserve">Target</w:t>
+            </w:r>
+          </w:p>
+        </w:tc>
+        <w:tc>
+          <w:tcPr>
+            <w:tcBorders>
+              <w:top w:val="single" w:sz="10" w:color="000000"/>
+              <w:bottom w:val="single" w:sz="6" w:color="000000"/>
+            </w:tcBorders>
+          </w:tcPr>
+          <w:p>
+            <w:pPr>
+              <w:pStyle w:val="Compact"/>
+              <w:spacing w:after="20" w:before="20" w:line="240" w:lineRule="auto"/>
+              <w:jc w:val="left"/>
+            </w:pPr>
+            <w:r>
+              <w:rPr>
+                <w:rFonts w:ascii="Times New Roman" w:hAnsi="Times New Roman"/>
+                <w:b/>
+                <w:sz w:val="17"/>
+              </w:rPr>
+              <w:t xml:space="preserve">Condition</w:t>
+            </w:r>
+          </w:p>
+        </w:tc>
+        <w:tc>
+          <w:tcPr>
+            <w:tcBorders>
+              <w:top w:val="single" w:sz="10" w:color="000000"/>
+              <w:bottom w:val="single" w:sz="6" w:color="000000"/>
+            </w:tcBorders>
+          </w:tcPr>
+          <w:p>
+            <w:pPr>
+              <w:pStyle w:val="Compact"/>
+              <w:spacing w:after="20" w:before="20" w:line="240" w:lineRule="auto"/>
+              <w:jc w:val="left"/>
+            </w:pPr>
+            <w:r>
+              <w:rPr>
+                <w:rFonts w:ascii="Times New Roman" w:hAnsi="Times New Roman"/>
+                <w:b/>
+                <w:sz w:val="17"/>
+              </w:rPr>
+              <w:t xml:space="preserve">Screen: AUC / detected</w:t>
+            </w:r>
+          </w:p>
+        </w:tc>
+        <w:tc>
+          <w:tcPr>
+            <w:tcBorders>
+              <w:top w:val="single" w:sz="10" w:color="000000"/>
+              <w:bottom w:val="single" w:sz="6" w:color="000000"/>
+            </w:tcBorders>
+          </w:tcPr>
+          <w:p>
+            <w:pPr>
+              <w:pStyle w:val="Compact"/>
+              <w:spacing w:after="20" w:before="20" w:line="240" w:lineRule="auto"/>
+              <w:jc w:val="left"/>
+            </w:pPr>
+            <w:r>
+              <w:rPr>
+                <w:rFonts w:ascii="Times New Roman" w:hAnsi="Times New Roman"/>
+                <w:b/>
+                <w:sz w:val="17"/>
+              </w:rPr>
+              <w:t xml:space="preserve">Gemini judge: AUC / detected</w:t>
+            </w:r>
+          </w:p>
+        </w:tc>
+        <w:tc>
+          <w:tcPr>
+            <w:tcBorders>
+              <w:top w:val="single" w:sz="10" w:color="000000"/>
+              <w:bottom w:val="single" w:sz="6" w:color="000000"/>
+            </w:tcBorders>
+          </w:tcPr>
+          <w:p>
+            <w:pPr>
+              <w:pStyle w:val="Compact"/>
+              <w:spacing w:after="20" w:before="20" w:line="240" w:lineRule="auto"/>
+              <w:jc w:val="left"/>
+            </w:pPr>
+            <w:r>
+              <w:rPr>
+                <w:rFonts w:ascii="Times New Roman" w:hAnsi="Times New Roman"/>
+                <w:b/>
+                <w:sz w:val="17"/>
+              </w:rPr>
+              <w:t xml:space="preserve">Fusion: AUC / detected</w:t>
+            </w:r>
+          </w:p>
+        </w:tc>
+      </w:tr>
+      <w:tr>
+        <w:tc>
+          <w:tcPr/>
+          <w:p>
+            <w:pPr>
+              <w:pStyle w:val="Compact"/>
+              <w:spacing w:after="20" w:before="20" w:line="240" w:lineRule="auto"/>
+              <w:jc w:val="left"/>
+            </w:pPr>
+            <w:r>
+              <w:rPr>
+                <w:rFonts w:ascii="Times New Roman" w:hAnsi="Times New Roman"/>
+                <w:sz w:val="17"/>
+              </w:rPr>
+              <w:t xml:space="preserve">GPT-4o</w:t>
+            </w:r>
+          </w:p>
+        </w:tc>
+        <w:tc>
+          <w:tcPr/>
+          <w:p>
+            <w:pPr>
+              <w:pStyle w:val="Compact"/>
+              <w:spacing w:after="20" w:before="20" w:line="240" w:lineRule="auto"/>
+              <w:jc w:val="left"/>
+            </w:pPr>
+            <w:r>
+              <w:rPr>
+                <w:rFonts w:ascii="Times New Roman" w:hAnsi="Times New Roman"/>
+                <w:sz w:val="17"/>
+              </w:rPr>
+              <w:t xml:space="preserve">Original</w:t>
+            </w:r>
+          </w:p>
+        </w:tc>
+        <w:tc>
+          <w:tcPr/>
+          <w:p>
+            <w:pPr>
+              <w:pStyle w:val="Compact"/>
+              <w:spacing w:after="20" w:before="20" w:line="240" w:lineRule="auto"/>
+              <w:jc w:val="left"/>
+            </w:pPr>
+            <w:r>
+              <w:rPr>
+                <w:rFonts w:ascii="Times New Roman" w:hAnsi="Times New Roman"/>
+                <w:sz w:val="17"/>
+              </w:rPr>
+              <w:t xml:space="preserve">0.817 / 0.12</w:t>
+            </w:r>
+          </w:p>
+        </w:tc>
+        <w:tc>
+          <w:tcPr/>
+          <w:p>
+            <w:pPr>
+              <w:pStyle w:val="Compact"/>
+              <w:spacing w:after="20" w:before="20" w:line="240" w:lineRule="auto"/>
+              <w:jc w:val="left"/>
+            </w:pPr>
+            <w:r>
+              <w:rPr>
+                <w:rFonts w:ascii="Times New Roman" w:hAnsi="Times New Roman"/>
+                <w:sz w:val="17"/>
+              </w:rPr>
+              <w:t xml:space="preserve">0.972 / 0.87</w:t>
+            </w:r>
+          </w:p>
+        </w:tc>
+        <w:tc>
+          <w:tcPr/>
+          <w:p>
+            <w:pPr>
+              <w:pStyle w:val="Compact"/>
+              <w:spacing w:after="20" w:before="20" w:line="240" w:lineRule="auto"/>
+              <w:jc w:val="left"/>
+            </w:pPr>
+            <w:r>
+              <w:rPr>
+                <w:rFonts w:ascii="Times New Roman" w:hAnsi="Times New Roman"/>
+                <w:sz w:val="17"/>
+              </w:rPr>
+              <w:t xml:space="preserve">0.966 / 0.82</w:t>
+            </w:r>
+          </w:p>
+        </w:tc>
+      </w:tr>
+      <w:tr>
+        <w:tc>
+          <w:tcPr/>
+          <w:p>
+            <w:pPr>
+              <w:pStyle w:val="Compact"/>
+              <w:spacing w:after="20" w:before="20" w:line="240" w:lineRule="auto"/>
+              <w:jc w:val="left"/>
+            </w:pPr>
+            <w:r>
+              <w:rPr>
+                <w:rFonts w:ascii="Times New Roman" w:hAnsi="Times New Roman"/>
+                <w:sz w:val="17"/>
+              </w:rPr>
+              <w:t xml:space="preserve">GPT-4o</w:t>
+            </w:r>
+          </w:p>
+        </w:tc>
+        <w:tc>
+          <w:tcPr/>
+          <w:p>
+            <w:pPr>
+              <w:pStyle w:val="Compact"/>
+              <w:spacing w:after="20" w:before="20" w:line="240" w:lineRule="auto"/>
+              <w:jc w:val="left"/>
+            </w:pPr>
+            <w:r>
+              <w:rPr>
+                <w:rFonts w:ascii="Times New Roman" w:hAnsi="Times New Roman"/>
+                <w:sz w:val="17"/>
+              </w:rPr>
+              <w:t xml:space="preserve">Hybrid attack</w:t>
+            </w:r>
+          </w:p>
+        </w:tc>
+        <w:tc>
+          <w:tcPr/>
+          <w:p>
+            <w:pPr>
+              <w:pStyle w:val="Compact"/>
+              <w:spacing w:after="20" w:before="20" w:line="240" w:lineRule="auto"/>
+              <w:jc w:val="left"/>
+            </w:pPr>
+            <w:r>
+              <w:rPr>
+                <w:rFonts w:ascii="Times New Roman" w:hAnsi="Times New Roman"/>
+                <w:sz w:val="17"/>
+              </w:rPr>
+              <w:t xml:space="preserve">0.790 / 0.07</w:t>
+            </w:r>
+          </w:p>
+        </w:tc>
+        <w:tc>
+          <w:tcPr/>
+          <w:p>
+            <w:pPr>
+              <w:pStyle w:val="Compact"/>
+              <w:spacing w:after="20" w:before="20" w:line="240" w:lineRule="auto"/>
+              <w:jc w:val="left"/>
+            </w:pPr>
+            <w:r>
+              <w:rPr>
+                <w:rFonts w:ascii="Times New Roman" w:hAnsi="Times New Roman"/>
+                <w:sz w:val="17"/>
+              </w:rPr>
+              <w:t xml:space="preserve">0.975 / 0.87</w:t>
+            </w:r>
+          </w:p>
+        </w:tc>
+        <w:tc>
+          <w:tcPr/>
+          <w:p>
+            <w:pPr>
+              <w:pStyle w:val="Compact"/>
+              <w:spacing w:after="20" w:before="20" w:line="240" w:lineRule="auto"/>
+              <w:jc w:val="left"/>
+            </w:pPr>
+            <w:r>
+              <w:rPr>
+                <w:rFonts w:ascii="Times New Roman" w:hAnsi="Times New Roman"/>
+                <w:sz w:val="17"/>
+              </w:rPr>
+              <w:t xml:space="preserve">0.958 / 0.77</w:t>
+            </w:r>
+          </w:p>
+        </w:tc>
+      </w:tr>
+      <w:tr>
+        <w:tc>
+          <w:tcPr/>
+          <w:p>
+            <w:pPr>
+              <w:pStyle w:val="Compact"/>
+              <w:spacing w:after="20" w:before="20" w:line="240" w:lineRule="auto"/>
+              <w:jc w:val="left"/>
+            </w:pPr>
+            <w:r>
+              <w:rPr>
+                <w:rFonts w:ascii="Times New Roman" w:hAnsi="Times New Roman"/>
+                <w:sz w:val="17"/>
+              </w:rPr>
+              <w:t xml:space="preserve">Claude</w:t>
+            </w:r>
+          </w:p>
+        </w:tc>
+        <w:tc>
+          <w:tcPr/>
+          <w:p>
+            <w:pPr>
+              <w:pStyle w:val="Compact"/>
+              <w:spacing w:after="20" w:before="20" w:line="240" w:lineRule="auto"/>
+              <w:jc w:val="left"/>
+            </w:pPr>
+            <w:r>
+              <w:rPr>
+                <w:rFonts w:ascii="Times New Roman" w:hAnsi="Times New Roman"/>
+                <w:sz w:val="17"/>
+              </w:rPr>
+              <w:t xml:space="preserve">Original</w:t>
+            </w:r>
+          </w:p>
+        </w:tc>
+        <w:tc>
+          <w:tcPr/>
+          <w:p>
+            <w:pPr>
+              <w:pStyle w:val="Compact"/>
+              <w:spacing w:after="20" w:before="20" w:line="240" w:lineRule="auto"/>
+              <w:jc w:val="left"/>
+            </w:pPr>
+            <w:r>
+              <w:rPr>
+                <w:rFonts w:ascii="Times New Roman" w:hAnsi="Times New Roman"/>
+                <w:sz w:val="17"/>
+              </w:rPr>
+              <w:t xml:space="preserve">0.746 / 0.22</w:t>
+            </w:r>
+          </w:p>
+        </w:tc>
+        <w:tc>
+          <w:tcPr/>
+          <w:p>
+            <w:pPr>
+              <w:pStyle w:val="Compact"/>
+              <w:spacing w:after="20" w:before="20" w:line="240" w:lineRule="auto"/>
+              <w:jc w:val="left"/>
+            </w:pPr>
+            <w:r>
+              <w:rPr>
+                <w:rFonts w:ascii="Times New Roman" w:hAnsi="Times New Roman"/>
+                <w:sz w:val="17"/>
+              </w:rPr>
+              <w:t xml:space="preserve">0.656 / 0.01</w:t>
+            </w:r>
+          </w:p>
+        </w:tc>
+        <w:tc>
+          <w:tcPr/>
+          <w:p>
+            <w:pPr>
+              <w:pStyle w:val="Compact"/>
+              <w:spacing w:after="20" w:before="20" w:line="240" w:lineRule="auto"/>
+              <w:jc w:val="left"/>
+            </w:pPr>
+            <w:r>
+              <w:rPr>
+                <w:rFonts w:ascii="Times New Roman" w:hAnsi="Times New Roman"/>
+                <w:sz w:val="17"/>
+              </w:rPr>
+              <w:t xml:space="preserve">0.774 / 0.35</w:t>
+            </w:r>
+          </w:p>
+        </w:tc>
+      </w:tr>
+      <w:tr>
+        <w:tc>
+          <w:tcPr/>
+          <w:p>
+            <w:pPr>
+              <w:pStyle w:val="Compact"/>
+              <w:spacing w:after="20" w:before="20" w:line="240" w:lineRule="auto"/>
+              <w:jc w:val="left"/>
+            </w:pPr>
+            <w:r>
+              <w:rPr>
+                <w:rFonts w:ascii="Times New Roman" w:hAnsi="Times New Roman"/>
+                <w:sz w:val="17"/>
+              </w:rPr>
+              <w:t xml:space="preserve">Claude</w:t>
+            </w:r>
+          </w:p>
+        </w:tc>
+        <w:tc>
+          <w:tcPr/>
+          <w:p>
+            <w:pPr>
+              <w:pStyle w:val="Compact"/>
+              <w:spacing w:after="20" w:before="20" w:line="240" w:lineRule="auto"/>
+              <w:jc w:val="left"/>
+            </w:pPr>
+            <w:r>
+              <w:rPr>
+                <w:rFonts w:ascii="Times New Roman" w:hAnsi="Times New Roman"/>
+                <w:sz w:val="17"/>
+              </w:rPr>
+              <w:t xml:space="preserve">Hybrid attack</w:t>
+            </w:r>
+          </w:p>
+        </w:tc>
+        <w:tc>
+          <w:tcPr/>
+          <w:p>
+            <w:pPr>
+              <w:pStyle w:val="Compact"/>
+              <w:spacing w:after="20" w:before="20" w:line="240" w:lineRule="auto"/>
+              <w:jc w:val="left"/>
+            </w:pPr>
+            <w:r>
+              <w:rPr>
+                <w:rFonts w:ascii="Times New Roman" w:hAnsi="Times New Roman"/>
+                <w:sz w:val="17"/>
+              </w:rPr>
+              <w:t xml:space="preserve">0.536 / 0.03</w:t>
+            </w:r>
+          </w:p>
+        </w:tc>
+        <w:tc>
+          <w:tcPr/>
+          <w:p>
+            <w:pPr>
+              <w:pStyle w:val="Compact"/>
+              <w:spacing w:after="20" w:before="20" w:line="240" w:lineRule="auto"/>
+              <w:jc w:val="left"/>
+            </w:pPr>
+            <w:r>
+              <w:rPr>
+                <w:rFonts w:ascii="Times New Roman" w:hAnsi="Times New Roman"/>
+                <w:sz w:val="17"/>
+              </w:rPr>
+              <w:t xml:space="preserve">0.840 / 0.35</w:t>
+            </w:r>
+          </w:p>
+        </w:tc>
+        <w:tc>
+          <w:tcPr/>
+          <w:p>
+            <w:pPr>
+              <w:pStyle w:val="Compact"/>
+              <w:spacing w:after="20" w:before="20" w:line="240" w:lineRule="auto"/>
+              <w:jc w:val="left"/>
+            </w:pPr>
+            <w:r>
+              <w:rPr>
+                <w:rFonts w:ascii="Times New Roman" w:hAnsi="Times New Roman"/>
+                <w:sz w:val="17"/>
+              </w:rPr>
+              <w:t xml:space="preserve">0.760 / 0.26</w:t>
+            </w:r>
+          </w:p>
+        </w:tc>
+      </w:tr>
+      <w:tr>
+        <w:tc>
+          <w:tcPr/>
+          <w:p>
+            <w:pPr>
+              <w:pStyle w:val="Compact"/>
+              <w:spacing w:after="20" w:before="20" w:line="240" w:lineRule="auto"/>
+              <w:jc w:val="left"/>
+            </w:pPr>
+            <w:r>
+              <w:rPr>
+                <w:rFonts w:ascii="Times New Roman" w:hAnsi="Times New Roman"/>
+                <w:sz w:val="17"/>
+              </w:rPr>
+              <w:t xml:space="preserve">Llama</w:t>
+            </w:r>
+          </w:p>
+        </w:tc>
+        <w:tc>
+          <w:tcPr/>
+          <w:p>
+            <w:pPr>
+              <w:pStyle w:val="Compact"/>
+              <w:spacing w:after="20" w:before="20" w:line="240" w:lineRule="auto"/>
+              <w:jc w:val="left"/>
+            </w:pPr>
+            <w:r>
+              <w:rPr>
+                <w:rFonts w:ascii="Times New Roman" w:hAnsi="Times New Roman"/>
+                <w:sz w:val="17"/>
+              </w:rPr>
+              <w:t xml:space="preserve">Original</w:t>
+            </w:r>
+          </w:p>
+        </w:tc>
+        <w:tc>
+          <w:tcPr/>
+          <w:p>
+            <w:pPr>
+              <w:pStyle w:val="Compact"/>
+              <w:spacing w:after="20" w:before="20" w:line="240" w:lineRule="auto"/>
+              <w:jc w:val="left"/>
+            </w:pPr>
+            <w:r>
+              <w:rPr>
+                <w:rFonts w:ascii="Times New Roman" w:hAnsi="Times New Roman"/>
+                <w:sz w:val="17"/>
+              </w:rPr>
+              <w:t xml:space="preserve">0.929 / 0.73</w:t>
+            </w:r>
+          </w:p>
+        </w:tc>
+        <w:tc>
+          <w:tcPr/>
+          <w:p>
+            <w:pPr>
+              <w:pStyle w:val="Compact"/>
+              <w:spacing w:after="20" w:before="20" w:line="240" w:lineRule="auto"/>
+              <w:jc w:val="left"/>
+            </w:pPr>
+            <w:r>
+              <w:rPr>
+                <w:rFonts w:ascii="Times New Roman" w:hAnsi="Times New Roman"/>
+                <w:sz w:val="17"/>
+              </w:rPr>
+              <w:t xml:space="preserve">0.974 / 0.89</w:t>
+            </w:r>
+          </w:p>
+        </w:tc>
+        <w:tc>
+          <w:tcPr/>
+          <w:p>
+            <w:pPr>
+              <w:pStyle w:val="Compact"/>
+              <w:spacing w:after="20" w:before="20" w:line="240" w:lineRule="auto"/>
+              <w:jc w:val="left"/>
+            </w:pPr>
+            <w:r>
+              <w:rPr>
+                <w:rFonts w:ascii="Times New Roman" w:hAnsi="Times New Roman"/>
+                <w:sz w:val="17"/>
+              </w:rPr>
+              <w:t xml:space="preserve">0.989 / 0.96</w:t>
+            </w:r>
+          </w:p>
+        </w:tc>
+      </w:tr>
+      <w:tr>
+        <w:tc>
+          <w:tcPr>
+            <w:tcBorders>
+              <w:bottom w:val="single" w:sz="10" w:color="000000"/>
+            </w:tcBorders>
+          </w:tcPr>
+          <w:p>
+            <w:pPr>
+              <w:pStyle w:val="Compact"/>
+              <w:spacing w:after="20" w:before="20" w:line="240" w:lineRule="auto"/>
+              <w:jc w:val="left"/>
+            </w:pPr>
+            <w:r>
+              <w:rPr>
+                <w:rFonts w:ascii="Times New Roman" w:hAnsi="Times New Roman"/>
+                <w:sz w:val="17"/>
+              </w:rPr>
+              <w:t xml:space="preserve">Llama</w:t>
+            </w:r>
+          </w:p>
+        </w:tc>
+        <w:tc>
+          <w:tcPr>
+            <w:tcBorders>
+              <w:bottom w:val="single" w:sz="10" w:color="000000"/>
+            </w:tcBorders>
+          </w:tcPr>
+          <w:p>
+            <w:pPr>
+              <w:pStyle w:val="Compact"/>
+              <w:spacing w:after="20" w:before="20" w:line="240" w:lineRule="auto"/>
+              <w:jc w:val="left"/>
+            </w:pPr>
+            <w:r>
+              <w:rPr>
+                <w:rFonts w:ascii="Times New Roman" w:hAnsi="Times New Roman"/>
+                <w:sz w:val="17"/>
+              </w:rPr>
+              <w:t xml:space="preserve">Hybrid attack</w:t>
+            </w:r>
+          </w:p>
+        </w:tc>
+        <w:tc>
+          <w:tcPr>
+            <w:tcBorders>
+              <w:bottom w:val="single" w:sz="10" w:color="000000"/>
+            </w:tcBorders>
+          </w:tcPr>
+          <w:p>
+            <w:pPr>
+              <w:pStyle w:val="Compact"/>
+              <w:spacing w:after="20" w:before="20" w:line="240" w:lineRule="auto"/>
+              <w:jc w:val="left"/>
+            </w:pPr>
+            <w:r>
+              <w:rPr>
+                <w:rFonts w:ascii="Times New Roman" w:hAnsi="Times New Roman"/>
+                <w:sz w:val="17"/>
+              </w:rPr>
+              <w:t xml:space="preserve">0.724 / 0.15</w:t>
+            </w:r>
+          </w:p>
+        </w:tc>
+        <w:tc>
+          <w:tcPr>
+            <w:tcBorders>
+              <w:bottom w:val="single" w:sz="10" w:color="000000"/>
+            </w:tcBorders>
+          </w:tcPr>
+          <w:p>
+            <w:pPr>
+              <w:pStyle w:val="Compact"/>
+              <w:spacing w:after="20" w:before="20" w:line="240" w:lineRule="auto"/>
+              <w:jc w:val="left"/>
+            </w:pPr>
+            <w:r>
+              <w:rPr>
+                <w:rFonts w:ascii="Times New Roman" w:hAnsi="Times New Roman"/>
+                <w:sz w:val="17"/>
+              </w:rPr>
+              <w:t xml:space="preserve">0.985 / 0.90</w:t>
+            </w:r>
+          </w:p>
+        </w:tc>
+        <w:tc>
+          <w:tcPr>
+            <w:tcBorders>
+              <w:bottom w:val="single" w:sz="10" w:color="000000"/>
+            </w:tcBorders>
+          </w:tcPr>
+          <w:p>
+            <w:pPr>
+              <w:pStyle w:val="Compact"/>
+              <w:spacing w:after="20" w:before="20" w:line="240" w:lineRule="auto"/>
+              <w:jc w:val="left"/>
+            </w:pPr>
+            <w:r>
+              <w:rPr>
+                <w:rFonts w:ascii="Times New Roman" w:hAnsi="Times New Roman"/>
+                <w:sz w:val="17"/>
+              </w:rPr>
+              <w:t xml:space="preserve">0.937 / 0.65</w:t>
+            </w:r>
+          </w:p>
+        </w:tc>
+      </w:tr>
+    </w:tbl>
+    <w:p>
+      <w:pPr>
+        <w:pStyle w:val="BodyText"/>
+      </w:pPr>
+      <w:r>
+        <w:t xml:space="preserve">Because the fusion averages in a screen that the attack has made uninformative, it did worse under attack than the judge alone (for example 0.937 against 0.985 for Llama papers). The cascade, which uses the screen as a gate, suffers in the same way, because attacked papers fall out of the top-scoring share and never reach the judge (Table 16). With machine papers at 10% of the pool, sending 30% of documents to the judge detected 88% of Llama papers before the attack and 54% after it; the cost saving of the cascade is therefore bought with a dependence on a screen that an informed author can defeat. Judging every document was unaffected (0.96 to 0.94 for Llama papers).</w:t>
+      </w:r>
+    </w:p>
+    <w:p>
+      <w:pPr>
+        <w:pStyle w:val="TableCaption"/>
+      </w:pPr>
+      <w:r>
+        <w:t xml:space="preserve">Table 16. Cascade before and after the hybrid attack: share of machine papers detected when at most 5% of human papers are flagged, in pools with 10% machine papers (95% intervals over bootstrap pools). The screen is trained without the target generator and without Llama.</w:t>
+      </w:r>
+    </w:p>
+    <w:tbl>
+      <w:tblPr>
+        <w:tblStyle w:val="Table"/>
+        <w:tblW w:type="auto" w:w="0"/>
+        <w:tblLayout w:type="autofit"/>
+        <w:tblLook w:firstRow="1" w:lastRow="0" w:firstColumn="0" w:lastColumn="0" w:noHBand="0" w:noVBand="0" w:val="0020"/>
+        <w:jc w:val="start"/>
+        <w:tblCaption w:val="Table 16. Cascade before and after the hybrid attack: share of machine papers detected when at most 5% of human papers are flagged, in pools with 10% machine papers (95% intervals over bootstrap pools). The screen is trained without the target generator and without Llama."/>
+      </w:tblPr>
+      <w:tblGrid>
+        <w:gridCol w:w="1980"/>
+        <w:gridCol w:w="1980"/>
+        <w:gridCol w:w="1980"/>
+        <w:gridCol w:w="1980"/>
+      </w:tblGrid>
+      <w:tr>
+        <w:trPr>
+          <w:tblHeader w:val="true"/>
+        </w:trPr>
+        <w:tc>
+          <w:tcPr>
+            <w:tcBorders>
+              <w:top w:val="single" w:sz="10" w:color="000000"/>
+              <w:bottom w:val="single" w:sz="6" w:color="000000"/>
+            </w:tcBorders>
+          </w:tcPr>
+          <w:p>
+            <w:pPr>
+              <w:pStyle w:val="Compact"/>
+              <w:spacing w:after="20" w:before="20" w:line="240" w:lineRule="auto"/>
+              <w:jc w:val="left"/>
+            </w:pPr>
+            <w:r>
+              <w:rPr>
+                <w:rFonts w:ascii="Times New Roman" w:hAnsi="Times New Roman"/>
+                <w:b/>
+                <w:sz w:val="17"/>
+              </w:rPr>
+              <w:t xml:space="preserve">Target</w:t>
+            </w:r>
+          </w:p>
+        </w:tc>
+        <w:tc>
+          <w:tcPr>
+            <w:tcBorders>
+              <w:top w:val="single" w:sz="10" w:color="000000"/>
+              <w:bottom w:val="single" w:sz="6" w:color="000000"/>
+            </w:tcBorders>
+          </w:tcPr>
+          <w:p>
+            <w:pPr>
+              <w:pStyle w:val="Compact"/>
+              <w:spacing w:after="20" w:before="20" w:line="240" w:lineRule="auto"/>
+              <w:jc w:val="right"/>
+            </w:pPr>
+            <w:r>
+              <w:rPr>
+                <w:rFonts w:ascii="Times New Roman" w:hAnsi="Times New Roman"/>
+                <w:b/>
+                <w:sz w:val="17"/>
+              </w:rPr>
+              <w:t xml:space="preserve">Share judged (q)</w:t>
+            </w:r>
+          </w:p>
+        </w:tc>
+        <w:tc>
+          <w:tcPr>
+            <w:tcBorders>
+              <w:top w:val="single" w:sz="10" w:color="000000"/>
+              <w:bottom w:val="single" w:sz="6" w:color="000000"/>
+            </w:tcBorders>
+          </w:tcPr>
+          <w:p>
+            <w:pPr>
+              <w:pStyle w:val="Compact"/>
+              <w:spacing w:after="20" w:before="20" w:line="240" w:lineRule="auto"/>
+              <w:jc w:val="left"/>
+            </w:pPr>
+            <w:r>
+              <w:rPr>
+                <w:rFonts w:ascii="Times New Roman" w:hAnsi="Times New Roman"/>
+                <w:b/>
+                <w:sz w:val="17"/>
+              </w:rPr>
+              <w:t xml:space="preserve">Original</w:t>
+            </w:r>
+          </w:p>
+        </w:tc>
+        <w:tc>
+          <w:tcPr>
+            <w:tcBorders>
+              <w:top w:val="single" w:sz="10" w:color="000000"/>
+              <w:bottom w:val="single" w:sz="6" w:color="000000"/>
+            </w:tcBorders>
+          </w:tcPr>
+          <w:p>
+            <w:pPr>
+              <w:pStyle w:val="Compact"/>
+              <w:spacing w:after="20" w:before="20" w:line="240" w:lineRule="auto"/>
+              <w:jc w:val="left"/>
+            </w:pPr>
+            <w:r>
+              <w:rPr>
+                <w:rFonts w:ascii="Times New Roman" w:hAnsi="Times New Roman"/>
+                <w:b/>
+                <w:sz w:val="17"/>
+              </w:rPr>
+              <w:t xml:space="preserve">Hybrid attack</w:t>
+            </w:r>
+          </w:p>
+        </w:tc>
+      </w:tr>
+      <w:tr>
+        <w:tc>
+          <w:tcPr/>
+          <w:p>
+            <w:pPr>
+              <w:pStyle w:val="Compact"/>
+              <w:spacing w:after="20" w:before="20" w:line="240" w:lineRule="auto"/>
+              <w:jc w:val="left"/>
+            </w:pPr>
+            <w:r>
+              <w:rPr>
+                <w:rFonts w:ascii="Times New Roman" w:hAnsi="Times New Roman"/>
+                <w:sz w:val="17"/>
+              </w:rPr>
+              <w:t xml:space="preserve">GPT-4o</w:t>
+            </w:r>
+          </w:p>
+        </w:tc>
+        <w:tc>
+          <w:tcPr/>
+          <w:p>
+            <w:pPr>
+              <w:pStyle w:val="Compact"/>
+              <w:spacing w:after="20" w:before="20" w:line="240" w:lineRule="auto"/>
+              <w:jc w:val="right"/>
+            </w:pPr>
+            <w:r>
+              <w:rPr>
+                <w:rFonts w:ascii="Times New Roman" w:hAnsi="Times New Roman"/>
+                <w:sz w:val="17"/>
+              </w:rPr>
+              <w:t xml:space="preserve">30%</w:t>
+            </w:r>
+          </w:p>
+        </w:tc>
+        <w:tc>
+          <w:tcPr/>
+          <w:p>
+            <w:pPr>
+              <w:pStyle w:val="Compact"/>
+              <w:spacing w:after="20" w:before="20" w:line="240" w:lineRule="auto"/>
+              <w:jc w:val="left"/>
+            </w:pPr>
+            <w:r>
+              <w:rPr>
+                <w:rFonts w:ascii="Times New Roman" w:hAnsi="Times New Roman"/>
+                <w:sz w:val="17"/>
+              </w:rPr>
+              <w:t xml:space="preserve">0.76 [0.59, 0.91]</w:t>
+            </w:r>
+          </w:p>
+        </w:tc>
+        <w:tc>
+          <w:tcPr/>
+          <w:p>
+            <w:pPr>
+              <w:pStyle w:val="Compact"/>
+              <w:spacing w:after="20" w:before="20" w:line="240" w:lineRule="auto"/>
+              <w:jc w:val="left"/>
+            </w:pPr>
+            <w:r>
+              <w:rPr>
+                <w:rFonts w:ascii="Times New Roman" w:hAnsi="Times New Roman"/>
+                <w:sz w:val="17"/>
+              </w:rPr>
+              <w:t xml:space="preserve">0.70 [0.48, 0.91]</w:t>
+            </w:r>
+          </w:p>
+        </w:tc>
+      </w:tr>
+      <w:tr>
+        <w:tc>
+          <w:tcPr/>
+          <w:p>
+            <w:pPr>
+              <w:pStyle w:val="Compact"/>
+              <w:spacing w:after="20" w:before="20" w:line="240" w:lineRule="auto"/>
+              <w:jc w:val="left"/>
+            </w:pPr>
+            <w:r>
+              <w:rPr>
+                <w:rFonts w:ascii="Times New Roman" w:hAnsi="Times New Roman"/>
+                <w:sz w:val="17"/>
+              </w:rPr>
+              <w:t xml:space="preserve">GPT-4o</w:t>
+            </w:r>
+          </w:p>
+        </w:tc>
+        <w:tc>
+          <w:tcPr/>
+          <w:p>
+            <w:pPr>
+              <w:pStyle w:val="Compact"/>
+              <w:spacing w:after="20" w:before="20" w:line="240" w:lineRule="auto"/>
+              <w:jc w:val="right"/>
+            </w:pPr>
+            <w:r>
+              <w:rPr>
+                <w:rFonts w:ascii="Times New Roman" w:hAnsi="Times New Roman"/>
+                <w:sz w:val="17"/>
+              </w:rPr>
+              <w:t xml:space="preserve">50%</w:t>
+            </w:r>
+          </w:p>
+        </w:tc>
+        <w:tc>
+          <w:tcPr/>
+          <w:p>
+            <w:pPr>
+              <w:pStyle w:val="Compact"/>
+              <w:spacing w:after="20" w:before="20" w:line="240" w:lineRule="auto"/>
+              <w:jc w:val="left"/>
+            </w:pPr>
+            <w:r>
+              <w:rPr>
+                <w:rFonts w:ascii="Times New Roman" w:hAnsi="Times New Roman"/>
+                <w:sz w:val="17"/>
+              </w:rPr>
+              <w:t xml:space="preserve">0.90 [0.73, 1.00]</w:t>
+            </w:r>
+          </w:p>
+        </w:tc>
+        <w:tc>
+          <w:tcPr/>
+          <w:p>
+            <w:pPr>
+              <w:pStyle w:val="Compact"/>
+              <w:spacing w:after="20" w:before="20" w:line="240" w:lineRule="auto"/>
+              <w:jc w:val="left"/>
+            </w:pPr>
+            <w:r>
+              <w:rPr>
+                <w:rFonts w:ascii="Times New Roman" w:hAnsi="Times New Roman"/>
+                <w:sz w:val="17"/>
+              </w:rPr>
+              <w:t xml:space="preserve">0.89 [0.73, 1.00]</w:t>
+            </w:r>
+          </w:p>
+        </w:tc>
+      </w:tr>
+      <w:tr>
+        <w:tc>
+          <w:tcPr/>
+          <w:p>
+            <w:pPr>
+              <w:pStyle w:val="Compact"/>
+              <w:spacing w:after="20" w:before="20" w:line="240" w:lineRule="auto"/>
+              <w:jc w:val="left"/>
+            </w:pPr>
+            <w:r>
+              <w:rPr>
+                <w:rFonts w:ascii="Times New Roman" w:hAnsi="Times New Roman"/>
+                <w:sz w:val="17"/>
+              </w:rPr>
+              <w:t xml:space="preserve">GPT-4o</w:t>
+            </w:r>
+          </w:p>
+        </w:tc>
+        <w:tc>
+          <w:tcPr/>
+          <w:p>
+            <w:pPr>
+              <w:pStyle w:val="Compact"/>
+              <w:spacing w:after="20" w:before="20" w:line="240" w:lineRule="auto"/>
+              <w:jc w:val="right"/>
+            </w:pPr>
+            <w:r>
+              <w:rPr>
+                <w:rFonts w:ascii="Times New Roman" w:hAnsi="Times New Roman"/>
+                <w:sz w:val="17"/>
+              </w:rPr>
+              <w:t xml:space="preserve">100%</w:t>
+            </w:r>
+          </w:p>
+        </w:tc>
+        <w:tc>
+          <w:tcPr/>
+          <w:p>
+            <w:pPr>
+              <w:pStyle w:val="Compact"/>
+              <w:spacing w:after="20" w:before="20" w:line="240" w:lineRule="auto"/>
+              <w:jc w:val="left"/>
+            </w:pPr>
+            <w:r>
+              <w:rPr>
+                <w:rFonts w:ascii="Times New Roman" w:hAnsi="Times New Roman"/>
+                <w:sz w:val="17"/>
+              </w:rPr>
+              <w:t xml:space="preserve">0.93 [0.77, 1.00]</w:t>
+            </w:r>
+          </w:p>
+        </w:tc>
+        <w:tc>
+          <w:tcPr/>
+          <w:p>
+            <w:pPr>
+              <w:pStyle w:val="Compact"/>
+              <w:spacing w:after="20" w:before="20" w:line="240" w:lineRule="auto"/>
+              <w:jc w:val="left"/>
+            </w:pPr>
+            <w:r>
+              <w:rPr>
+                <w:rFonts w:ascii="Times New Roman" w:hAnsi="Times New Roman"/>
+                <w:sz w:val="17"/>
+              </w:rPr>
+              <w:t xml:space="preserve">0.93 [0.77, 1.00]</w:t>
+            </w:r>
+          </w:p>
+        </w:tc>
+      </w:tr>
+      <w:tr>
+        <w:tc>
+          <w:tcPr/>
+          <w:p>
+            <w:pPr>
+              <w:pStyle w:val="Compact"/>
+              <w:spacing w:after="20" w:before="20" w:line="240" w:lineRule="auto"/>
+              <w:jc w:val="left"/>
+            </w:pPr>
+            <w:r>
+              <w:rPr>
+                <w:rFonts w:ascii="Times New Roman" w:hAnsi="Times New Roman"/>
+                <w:sz w:val="17"/>
+              </w:rPr>
+              <w:t xml:space="preserve">Claude</w:t>
+            </w:r>
+          </w:p>
+        </w:tc>
+        <w:tc>
+          <w:tcPr/>
+          <w:p>
+            <w:pPr>
+              <w:pStyle w:val="Compact"/>
+              <w:spacing w:after="20" w:before="20" w:line="240" w:lineRule="auto"/>
+              <w:jc w:val="right"/>
+            </w:pPr>
+            <w:r>
+              <w:rPr>
+                <w:rFonts w:ascii="Times New Roman" w:hAnsi="Times New Roman"/>
+                <w:sz w:val="17"/>
+              </w:rPr>
+              <w:t xml:space="preserve">30%</w:t>
+            </w:r>
+          </w:p>
+        </w:tc>
+        <w:tc>
+          <w:tcPr/>
+          <w:p>
+            <w:pPr>
+              <w:pStyle w:val="Compact"/>
+              <w:spacing w:after="20" w:before="20" w:line="240" w:lineRule="auto"/>
+              <w:jc w:val="left"/>
+            </w:pPr>
+            <w:r>
+              <w:rPr>
+                <w:rFonts w:ascii="Times New Roman" w:hAnsi="Times New Roman"/>
+                <w:sz w:val="17"/>
+              </w:rPr>
+              <w:t xml:space="preserve">0.30 [0.05, 0.55]</w:t>
+            </w:r>
+          </w:p>
+        </w:tc>
+        <w:tc>
+          <w:tcPr/>
+          <w:p>
+            <w:pPr>
+              <w:pStyle w:val="Compact"/>
+              <w:spacing w:after="20" w:before="20" w:line="240" w:lineRule="auto"/>
+              <w:jc w:val="left"/>
+            </w:pPr>
+            <w:r>
+              <w:rPr>
+                <w:rFonts w:ascii="Times New Roman" w:hAnsi="Times New Roman"/>
+                <w:sz w:val="17"/>
+              </w:rPr>
+              <w:t xml:space="preserve">0.20 [0.05, 0.36]</w:t>
+            </w:r>
+          </w:p>
+        </w:tc>
+      </w:tr>
+      <w:tr>
+        <w:tc>
+          <w:tcPr/>
+          <w:p>
+            <w:pPr>
+              <w:pStyle w:val="Compact"/>
+              <w:spacing w:after="20" w:before="20" w:line="240" w:lineRule="auto"/>
+              <w:jc w:val="left"/>
+            </w:pPr>
+            <w:r>
+              <w:rPr>
+                <w:rFonts w:ascii="Times New Roman" w:hAnsi="Times New Roman"/>
+                <w:sz w:val="17"/>
+              </w:rPr>
+              <w:t xml:space="preserve">Claude</w:t>
+            </w:r>
+          </w:p>
+        </w:tc>
+        <w:tc>
+          <w:tcPr/>
+          <w:p>
+            <w:pPr>
+              <w:pStyle w:val="Compact"/>
+              <w:spacing w:after="20" w:before="20" w:line="240" w:lineRule="auto"/>
+              <w:jc w:val="right"/>
+            </w:pPr>
+            <w:r>
+              <w:rPr>
+                <w:rFonts w:ascii="Times New Roman" w:hAnsi="Times New Roman"/>
+                <w:sz w:val="17"/>
+              </w:rPr>
+              <w:t xml:space="preserve">50%</w:t>
+            </w:r>
+          </w:p>
+        </w:tc>
+        <w:tc>
+          <w:tcPr/>
+          <w:p>
+            <w:pPr>
+              <w:pStyle w:val="Compact"/>
+              <w:spacing w:after="20" w:before="20" w:line="240" w:lineRule="auto"/>
+              <w:jc w:val="left"/>
+            </w:pPr>
+            <w:r>
+              <w:rPr>
+                <w:rFonts w:ascii="Times New Roman" w:hAnsi="Times New Roman"/>
+                <w:sz w:val="17"/>
+              </w:rPr>
+              <w:t xml:space="preserve">0.12 [0.00, 0.34]</w:t>
+            </w:r>
+          </w:p>
+        </w:tc>
+        <w:tc>
+          <w:tcPr/>
+          <w:p>
+            <w:pPr>
+              <w:pStyle w:val="Compact"/>
+              <w:spacing w:after="20" w:before="20" w:line="240" w:lineRule="auto"/>
+              <w:jc w:val="left"/>
+            </w:pPr>
+            <w:r>
+              <w:rPr>
+                <w:rFonts w:ascii="Times New Roman" w:hAnsi="Times New Roman"/>
+                <w:sz w:val="17"/>
+              </w:rPr>
+              <w:t xml:space="preserve">0.31 [0.09, 0.52]</w:t>
+            </w:r>
+          </w:p>
+        </w:tc>
+      </w:tr>
+      <w:tr>
+        <w:tc>
+          <w:tcPr/>
+          <w:p>
+            <w:pPr>
+              <w:pStyle w:val="Compact"/>
+              <w:spacing w:after="20" w:before="20" w:line="240" w:lineRule="auto"/>
+              <w:jc w:val="left"/>
+            </w:pPr>
+            <w:r>
+              <w:rPr>
+                <w:rFonts w:ascii="Times New Roman" w:hAnsi="Times New Roman"/>
+                <w:sz w:val="17"/>
+              </w:rPr>
+              <w:t xml:space="preserve">Claude</w:t>
+            </w:r>
+          </w:p>
+        </w:tc>
+        <w:tc>
+          <w:tcPr/>
+          <w:p>
+            <w:pPr>
+              <w:pStyle w:val="Compact"/>
+              <w:spacing w:after="20" w:before="20" w:line="240" w:lineRule="auto"/>
+              <w:jc w:val="right"/>
+            </w:pPr>
+            <w:r>
+              <w:rPr>
+                <w:rFonts w:ascii="Times New Roman" w:hAnsi="Times New Roman"/>
+                <w:sz w:val="17"/>
+              </w:rPr>
+              <w:t xml:space="preserve">100%</w:t>
+            </w:r>
+          </w:p>
+        </w:tc>
+        <w:tc>
+          <w:tcPr/>
+          <w:p>
+            <w:pPr>
+              <w:pStyle w:val="Compact"/>
+              <w:spacing w:after="20" w:before="20" w:line="240" w:lineRule="auto"/>
+              <w:jc w:val="left"/>
+            </w:pPr>
+            <w:r>
+              <w:rPr>
+                <w:rFonts w:ascii="Times New Roman" w:hAnsi="Times New Roman"/>
+                <w:sz w:val="17"/>
+              </w:rPr>
+              <w:t xml:space="preserve">0.11 [0.00, 0.27]</w:t>
+            </w:r>
+          </w:p>
+        </w:tc>
+        <w:tc>
+          <w:tcPr/>
+          <w:p>
+            <w:pPr>
+              <w:pStyle w:val="Compact"/>
+              <w:spacing w:after="20" w:before="20" w:line="240" w:lineRule="auto"/>
+              <w:jc w:val="left"/>
+            </w:pPr>
+            <w:r>
+              <w:rPr>
+                <w:rFonts w:ascii="Times New Roman" w:hAnsi="Times New Roman"/>
+                <w:sz w:val="17"/>
+              </w:rPr>
+              <w:t xml:space="preserve">0.41 [0.18, 0.64]</w:t>
+            </w:r>
+          </w:p>
+        </w:tc>
+      </w:tr>
+      <w:tr>
+        <w:tc>
+          <w:tcPr/>
+          <w:p>
+            <w:pPr>
+              <w:pStyle w:val="Compact"/>
+              <w:spacing w:after="20" w:before="20" w:line="240" w:lineRule="auto"/>
+              <w:jc w:val="left"/>
+            </w:pPr>
+            <w:r>
+              <w:rPr>
+                <w:rFonts w:ascii="Times New Roman" w:hAnsi="Times New Roman"/>
+                <w:sz w:val="17"/>
+              </w:rPr>
+              <w:t xml:space="preserve">Llama</w:t>
+            </w:r>
+          </w:p>
+        </w:tc>
+        <w:tc>
+          <w:tcPr/>
+          <w:p>
+            <w:pPr>
+              <w:pStyle w:val="Compact"/>
+              <w:spacing w:after="20" w:before="20" w:line="240" w:lineRule="auto"/>
+              <w:jc w:val="right"/>
+            </w:pPr>
+            <w:r>
+              <w:rPr>
+                <w:rFonts w:ascii="Times New Roman" w:hAnsi="Times New Roman"/>
+                <w:sz w:val="17"/>
+              </w:rPr>
+              <w:t xml:space="preserve">30%</w:t>
+            </w:r>
+          </w:p>
+        </w:tc>
+        <w:tc>
+          <w:tcPr/>
+          <w:p>
+            <w:pPr>
+              <w:pStyle w:val="Compact"/>
+              <w:spacing w:after="20" w:before="20" w:line="240" w:lineRule="auto"/>
+              <w:jc w:val="left"/>
+            </w:pPr>
+            <w:r>
+              <w:rPr>
+                <w:rFonts w:ascii="Times New Roman" w:hAnsi="Times New Roman"/>
+                <w:sz w:val="17"/>
+              </w:rPr>
+              <w:t xml:space="preserve">0.88 [0.73, 1.00]</w:t>
+            </w:r>
+          </w:p>
+        </w:tc>
+        <w:tc>
+          <w:tcPr/>
+          <w:p>
+            <w:pPr>
+              <w:pStyle w:val="Compact"/>
+              <w:spacing w:after="20" w:before="20" w:line="240" w:lineRule="auto"/>
+              <w:jc w:val="left"/>
+            </w:pPr>
+            <w:r>
+              <w:rPr>
+                <w:rFonts w:ascii="Times New Roman" w:hAnsi="Times New Roman"/>
+                <w:sz w:val="17"/>
+              </w:rPr>
+              <w:t xml:space="preserve">0.54 [0.32, 0.73]</w:t>
+            </w:r>
+          </w:p>
+        </w:tc>
+      </w:tr>
+      <w:tr>
+        <w:tc>
+          <w:tcPr/>
+          <w:p>
+            <w:pPr>
+              <w:pStyle w:val="Compact"/>
+              <w:spacing w:after="20" w:before="20" w:line="240" w:lineRule="auto"/>
+              <w:jc w:val="left"/>
+            </w:pPr>
+            <w:r>
+              <w:rPr>
+                <w:rFonts w:ascii="Times New Roman" w:hAnsi="Times New Roman"/>
+                <w:sz w:val="17"/>
+              </w:rPr>
+              <w:t xml:space="preserve">Llama</w:t>
+            </w:r>
+          </w:p>
+        </w:tc>
+        <w:tc>
+          <w:tcPr/>
+          <w:p>
+            <w:pPr>
+              <w:pStyle w:val="Compact"/>
+              <w:spacing w:after="20" w:before="20" w:line="240" w:lineRule="auto"/>
+              <w:jc w:val="right"/>
+            </w:pPr>
+            <w:r>
+              <w:rPr>
+                <w:rFonts w:ascii="Times New Roman" w:hAnsi="Times New Roman"/>
+                <w:sz w:val="17"/>
+              </w:rPr>
+              <w:t xml:space="preserve">50%</w:t>
+            </w:r>
+          </w:p>
+        </w:tc>
+        <w:tc>
+          <w:tcPr/>
+          <w:p>
+            <w:pPr>
+              <w:pStyle w:val="Compact"/>
+              <w:spacing w:after="20" w:before="20" w:line="240" w:lineRule="auto"/>
+              <w:jc w:val="left"/>
+            </w:pPr>
+            <w:r>
+              <w:rPr>
+                <w:rFonts w:ascii="Times New Roman" w:hAnsi="Times New Roman"/>
+                <w:sz w:val="17"/>
+              </w:rPr>
+              <w:t xml:space="preserve">0.96 [0.86, 1.00]</w:t>
+            </w:r>
+          </w:p>
+        </w:tc>
+        <w:tc>
+          <w:tcPr/>
+          <w:p>
+            <w:pPr>
+              <w:pStyle w:val="Compact"/>
+              <w:spacing w:after="20" w:before="20" w:line="240" w:lineRule="auto"/>
+              <w:jc w:val="left"/>
+            </w:pPr>
+            <w:r>
+              <w:rPr>
+                <w:rFonts w:ascii="Times New Roman" w:hAnsi="Times New Roman"/>
+                <w:sz w:val="17"/>
+              </w:rPr>
+              <w:t xml:space="preserve">0.78 [0.59, 0.91]</w:t>
+            </w:r>
+          </w:p>
+        </w:tc>
+      </w:tr>
+      <w:tr>
+        <w:tc>
+          <w:tcPr>
+            <w:tcBorders>
+              <w:bottom w:val="single" w:sz="10" w:color="000000"/>
+            </w:tcBorders>
+          </w:tcPr>
+          <w:p>
+            <w:pPr>
+              <w:pStyle w:val="Compact"/>
+              <w:spacing w:after="20" w:before="20" w:line="240" w:lineRule="auto"/>
+              <w:jc w:val="left"/>
+            </w:pPr>
+            <w:r>
+              <w:rPr>
+                <w:rFonts w:ascii="Times New Roman" w:hAnsi="Times New Roman"/>
+                <w:sz w:val="17"/>
+              </w:rPr>
+              <w:t xml:space="preserve">Llama</w:t>
+            </w:r>
+          </w:p>
+        </w:tc>
+        <w:tc>
+          <w:tcPr>
+            <w:tcBorders>
+              <w:bottom w:val="single" w:sz="10" w:color="000000"/>
+            </w:tcBorders>
+          </w:tcPr>
+          <w:p>
+            <w:pPr>
+              <w:pStyle w:val="Compact"/>
+              <w:spacing w:after="20" w:before="20" w:line="240" w:lineRule="auto"/>
+              <w:jc w:val="right"/>
+            </w:pPr>
+            <w:r>
+              <w:rPr>
+                <w:rFonts w:ascii="Times New Roman" w:hAnsi="Times New Roman"/>
+                <w:sz w:val="17"/>
+              </w:rPr>
+              <w:t xml:space="preserve">100%</w:t>
+            </w:r>
+          </w:p>
+        </w:tc>
+        <w:tc>
+          <w:tcPr>
+            <w:tcBorders>
+              <w:bottom w:val="single" w:sz="10" w:color="000000"/>
+            </w:tcBorders>
+          </w:tcPr>
+          <w:p>
+            <w:pPr>
+              <w:pStyle w:val="Compact"/>
+              <w:spacing w:after="20" w:before="20" w:line="240" w:lineRule="auto"/>
+              <w:jc w:val="left"/>
+            </w:pPr>
+            <w:r>
+              <w:rPr>
+                <w:rFonts w:ascii="Times New Roman" w:hAnsi="Times New Roman"/>
+                <w:sz w:val="17"/>
+              </w:rPr>
+              <w:t xml:space="preserve">0.96 [0.86, 1.00]</w:t>
+            </w:r>
+          </w:p>
+        </w:tc>
+        <w:tc>
+          <w:tcPr>
+            <w:tcBorders>
+              <w:bottom w:val="single" w:sz="10" w:color="000000"/>
+            </w:tcBorders>
+          </w:tcPr>
+          <w:p>
+            <w:pPr>
+              <w:pStyle w:val="Compact"/>
+              <w:spacing w:after="20" w:before="20" w:line="240" w:lineRule="auto"/>
+              <w:jc w:val="left"/>
+            </w:pPr>
+            <w:r>
+              <w:rPr>
+                <w:rFonts w:ascii="Times New Roman" w:hAnsi="Times New Roman"/>
+                <w:sz w:val="17"/>
+              </w:rPr>
+              <w:t xml:space="preserve">0.94 [0.82, 1.00]</w:t>
+            </w:r>
+          </w:p>
+        </w:tc>
+      </w:tr>
+    </w:tbl>
     <w:bookmarkEnd w:id="45"/>
     <w:bookmarkStart w:id="46" w:name="cost"/>
     <w:p>
@@ -10303,7 +11773,7 @@
         <w:pStyle w:val="BodyText"/>
       </w:pPr>
       <w:r>
-        <w:t xml:space="preserve">Third, a screen whose features are known is fragile. A crude edit of five easily changed events cut detection from 53% to 8%, whereas a generic LLM rewrite did not evade the screen and for one generator made detection easier, so the fragility lies in knowing the features and not in rewriting power as such. Publishing the features, as research does, supplies that knowledge. The model shows why the edit result should be expected: when evasion is cheap relative to the stakes, equilibrium detection is far below the figure that non-adaptive authors would produce. The detectability paradox means that a very effective screen can provoke enough evasion to underperform a weaker one. Designing a screen therefore means choosing features that are costly to manipulate, not only features that discriminate. In our data, passives and nominalizations played that role, which echoes the economic logic that a signal is informative only to the extent that it is costly to fake (Spence 1973; Connelly et al. 2011). Because we publish our method, the relevant benchmark for any deployed version is the equilibrium detection rate, not the headline accuracy in this paper.</w:t>
+        <w:t xml:space="preserve">Third, a screen whose features are known is fragile. A crude edit of five easily changed events cut detection from 53% to 8%, whereas a generic LLM rewrite did not evade the screen and for one generator made detection easier, so the fragility lies in knowing the features and not in rewriting power as such. Publishing the features, as research does, supplies that knowledge. The model shows why the edit result should be expected: when evasion is cheap relative to the stakes, equilibrium detection is far below the figure that non-adaptive authors would produce. The detectability paradox means that a very effective screen can provoke enough evasion to underperform a weaker one. Designing a screen therefore means choosing features that are costly to manipulate, not only features that discriminate. In our data, passives and nominalizations played that role, which echoes the economic logic that a signal is informative only to the extent that it is costly to fake (Spence 1973; Connelly et al. 2011). Because we publish our method, the relevant benchmark for any deployed version is the equilibrium detection rate, not the headline accuracy in this paper. The judge, by contrast, was not fooled by the hybrid attack that defeated the screen, which suggests that the two stages of a cascade differ in robustness as well as in price. A cascade that gates the judge with a known, editable screen inherits the screen’s fragility, and one that gates it with features that are costly to edit would not.</w:t>
       </w:r>
     </w:p>
     <w:p>
@@ -10345,7 +11815,7 @@
         <w:pStyle w:val="BodyText"/>
       </w:pPr>
       <w:r>
-        <w:t xml:space="preserve">The economic model is simple. It assumes that investigating a flagged paper settles its status at a fixed cost, which is generous given that human reviewers often cannot distinguish machine text, and that capacity is unlimited. The costs of review and of a missed paper and the base rate are assumed, not measured, so the cost results are structural illustrations and not estimates for any organization. The judge’s operating point is fixed at a threshold of 50. The strategic extension considers a single decision by a single author, takes the base rate as given, and uses a quadratic cost of effort. The programmatic adversarial test is crude; it is a lower bound on an adaptive author, who could edit passives and nominalizations too, or optimize against the detector’s weights. The generic LLM rewrite used a single attacker (Llama), a single prompt, and the clustering screen only. The hybrid of rewriting and feature-aware editing was no stronger than the edit alone, but neither attack edits passives and nominalizations or optimizes against the detector’s weights, so an adaptive author could do better than any of our attacks. The hard-to-edit feature set was chosen because our attack left it untouched, so its robustness is conditional on that attack. The judges were not evaluated on the attacked papers, and the programmatic edits would probably be noticed by a language-model judge or a human reader. We did not run MAUVE or BERTScore, we did not test light human editing of machine text, and we did not test whether explainable evidence improves human decisions.</w:t>
+        <w:t xml:space="preserve">The economic model is simple. It assumes that investigating a flagged paper settles its status at a fixed cost, which is generous given that human reviewers often cannot distinguish machine text, and that capacity is unlimited. The costs of review and of a missed paper and the base rate are assumed, not measured, so the cost results are structural illustrations and not estimates for any organization. The judge’s operating point is fixed at a threshold of 50. The strategic extension considers a single decision by a single author, takes the base rate as given, and uses a quadratic cost of effort. The programmatic adversarial test is crude; it is a lower bound on an adaptive author, who could edit passives and nominalizations too, or optimize against the detector’s weights. The generic LLM rewrite used a single attacker (Llama), a single prompt, and the clustering screen only. The hybrid of rewriting and feature-aware editing was no stronger than the edit alone, but neither attack edits passives and nominalizations or optimizes against the detector’s weights, so an adaptive author could do better than any of our attacks. The hard-to-edit feature set was chosen because our attack left it untouched, so its robustness is conditional on that attack. The judge was evaluated only on the hybrid-attacked papers, with one attacker, so we cannot separate the effect of the edit from that of the rewrite, and we did not evaluate it on rewrite-only or edit-only papers or evaluate the GPT-4o judge on any attacked papers. The programmatic edits might be noticed by a human reader. We did not run MAUVE or BERTScore, we did not test light human editing of machine text, and we did not test whether explainable evidence improves human decisions.</w:t>
       </w:r>
     </w:p>
     <w:p>
@@ -10353,7 +11823,7 @@
         <w:pStyle w:val="BodyText"/>
       </w:pPr>
       <w:r>
-        <w:t xml:space="preserve">Four steps would turn this pilot into a fuller test. The first is a stronger adversary: an attack that also edits passives and nominalizations or optimizes against the detector’s weights, evaluated against both the screen and the judges, and with more than one attacker model. The second is to measure the parameters the model needs, with data on the base rate of machine-written submissions, on the cost of investigating a flag, and on the accuracy of human review, which would replace our illustrative values. The third is to add generators, especially open-weight models and future releases, and to replace the Poisson benchmark with a negative binomial reference and the moment estimator with a full likelihood. The fourth is a randomized experiment in which domain experts classify real and fabricated papers with and without an explainable indicator, which would test whether the transparency of count-based features improves decisions.</w:t>
+        <w:t xml:space="preserve">Four steps would turn this pilot into a fuller test. The first is a stronger adversary: an attack that also edits passives and nominalizations or optimizes against the detector’s weights, evaluated against both the screen and the judges, with edit-only and rewrite-only papers also given to the judge, and with more than one attacker model. The second is to measure the parameters the model needs, with data on the base rate of machine-written submissions, on the cost of investigating a flag, and on the accuracy of human review, which would replace our illustrative values. The third is to add generators, especially open-weight models and future releases, and to replace the Poisson benchmark with a negative binomial reference and the moment estimator with a full likelihood. The fourth is a randomized experiment in which domain experts classify real and fabricated papers with and without an explainable indicator, which would test whether the transparency of count-based features improves decisions.</w:t>
       </w:r>
     </w:p>
     <w:bookmarkEnd w:id="49"/>
@@ -10371,7 +11841,7 @@
         <w:pStyle w:val="FirstParagraph"/>
       </w:pPr>
       <w:r>
-        <w:t xml:space="preserve">Whether to screen for machine-written scholarly text is an economic decision, and the value of a screen depends on three things that detection accuracy leaves out: the base rate of machine papers, the cost of false alarms and misses, and how authors respond. In a model of cascaded screening, a free statistical screen is worth most because it raises the base rate that an expensive judge sees, a judge with a blind spot is worth little, and a screen whose features are known can lose most of its power through evasion. Calibrated on three generators, the cheap screen detected machine papers well only within a generator, a strong LLM judge missed one generator almost completely, a simple cascade kept most of the judge’s detection at a fraction of its cost when machine papers were rare, and a crude feature-aware edit cut the screen’s detection from 53% to 8%, whereas a generic LLM rewrite did not evade it. Organizations should therefore evaluate screens by their equilibrium performance against adapting authors, favor features that are costly to manipulate, and plan to maintain them. The evidence comes from three generators, one genre, and two judges, and a stronger adversary and measured cost parameters would be needed to turn these illustrations into estimates.</w:t>
+        <w:t xml:space="preserve">Whether to screen for machine-written scholarly text is an economic decision, and the value of a screen depends on three things that detection accuracy leaves out: the base rate of machine papers, the cost of false alarms and misses, and how authors respond. In a model of cascaded screening, a free statistical screen is worth most because it raises the base rate that an expensive judge sees, a judge with a blind spot is worth little, and a screen whose features are known can lose most of its power through evasion. Calibrated on three generators, the cheap screen detected machine papers well only within a generator, a strong LLM judge missed one generator almost completely, a simple cascade kept most of the judge’s detection at a fraction of its cost when machine papers were rare, and a crude feature-aware edit cut the screen’s detection from 53% to 8%, whereas a generic LLM rewrite did not evade it. The same edit, applied after a rewrite, did not fool the judge, and the cascade, which depends on the screen, lost much of its detection when attacked. Organizations should therefore evaluate screens by their equilibrium performance against adapting authors, favor features that are costly to manipulate, and plan to maintain them. The evidence comes from three generators, one genre, and two judges, and a stronger adversary and measured cost parameters would be needed to turn these illustrations into estimates.</w:t>
       </w:r>
     </w:p>
     <w:bookmarkEnd w:id="50"/>

</xml_diff>

<commit_message>
Add judge on edit-only attacked papers and paired comparisons; update paper
Co-Authored-By: Claude Sonnet 5.5 <noreply@anthropic.com>
Claude-Session: https://claude.ai/code/session_01FLb7uVf7YBgdoa75gbZ2sf
</commit_message>
<xml_diff>
--- a/paper/Screening_Economics_Paper.docx
+++ b/paper/Screening_Economics_Paper.docx
@@ -10258,7 +10258,20 @@
         <w:pStyle w:val="BodyText"/>
       </w:pPr>
       <w:r>
-        <w:t xml:space="preserve">We then gave the Gemini judge the hybrid-attacked papers (the 300 machine papers, rewritten and then edited, in their first 2,000 tokens; US$5.46 in judge calls). The judge was not fooled (Table 15). Its AUC stayed at 0.975 for GPT-4o papers, rose slightly for Llama papers (0.974 to 0.985), and rose clearly for Claude papers (0.656 to 0.840, with the share detected at a 5% false-positive rate going from 0.01 to 0.35), while the screen’s AUC on the same papers fell from 0.746 to 0.536 for Claude and from 0.929 to 0.724 for Llama. We cannot say whether the improvement for Claude comes from the edit or from the rewrite: the judge saw text rewritten by Llama, whose style the judge may recognize as machine-like, and we did not give the judge the edit-only or rewrite-only papers. What the result does show is that a hybrid attack that defeats the count-based screen does not defeat this judge.</w:t>
+        <w:t xml:space="preserve">We then gave the Gemini judge two sets of attacked papers: the hybrid-attacked papers (rewritten and then edited) and the edit-only papers, each the 300 machine papers in their first 2,000 tokens (US$11.27 in judge calls for the two sets). The judge was not fooled by either (Table 15). For GPT-4o and Llama papers its AUC did not fall: the paired differences in AUC on the same papers were +0.004 (95% interval −0.017 to +0.024) and +0.013 (−0.003 to +0.033) for the hybrid attack, and +0.008 (−0.009 to +0.029) and +0.014 (+0.002 to +0.032) for the edit alone. For Claude papers both attacks made detection</w:t>
+      </w:r>
+      <w:r>
+        <w:t xml:space="preserve"> </w:t>
+      </w:r>
+      <w:r>
+        <w:rPr>
+          <w:iCs/>
+          <w:i/>
+        </w:rPr>
+        <w:t xml:space="preserve">easier</w:t>
+      </w:r>
+      <w:r>
+        <w:t xml:space="preserve">, by +0.167 (0.102 to 0.228) for the hybrid and +0.080 (0.021 to 0.144) for the edit alone, with the share detected at a 5% false-positive rate rising from 0.01 to 0.35 and 0.05. The screen, on the same papers, fell to an AUC of 0.536 and 0.493 for Claude papers and to 0.724 and 0.721 for Llama papers. Roughly half of the judge’s improvement for Claude comes from the edit and the rest from the rewrite, whose style the judge may recognize as machine-like; we did not give the judge rewrite-only papers, and we did not test why the edit helps the judge, although inserted citation numbers in mid-sentence may look unnatural. What the results do show is that attacks that defeat the count-based screen do not defeat this judge.</w:t>
       </w:r>
     </w:p>
     <w:p>
@@ -10266,7 +10279,7 @@
         <w:pStyle w:val="TableCaption"/>
       </w:pPr>
       <w:r>
-        <w:t xml:space="preserve">Table 15. The screen, the Gemini judge, and their rank-average fusion before and after the hybrid attack: AUC / share of machine papers detected at a 5% false-positive rate. The screen here is trained without the target generator and without Llama (the rewriter), so its original-text values differ from those in Tables 5 and 6, which include Llama in training.</w:t>
+        <w:t xml:space="preserve">Table 15. The screen, the Gemini judge, and their rank-average fusion before and after the edit-only and hybrid attacks: AUC / share of machine papers detected at a 5% false-positive rate. The screen here is trained without the target generator and without Llama (the rewriter), so its original-text values differ from those in Tables 5 and 6, which include Llama in training.</w:t>
       </w:r>
     </w:p>
     <w:tbl>
@@ -10276,7 +10289,7 @@
         <w:tblLayout w:type="autofit"/>
         <w:tblLook w:firstRow="1" w:lastRow="0" w:firstColumn="0" w:lastColumn="0" w:noHBand="0" w:noVBand="0" w:val="0020"/>
         <w:jc w:val="start"/>
-        <w:tblCaption w:val="Table 15. The screen, the Gemini judge, and their rank-average fusion before and after the hybrid attack: AUC / share of machine papers detected at a 5% false-positive rate. The screen here is trained without the target generator and without Llama (the rewriter), so its original-text values differ from those in Tables 5 and 6, which include Llama in training."/>
+        <w:tblCaption w:val="Table 15. The screen, the Gemini judge, and their rank-average fusion before and after the edit-only and hybrid attacks: AUC / share of machine papers detected at a 5% false-positive rate. The screen here is trained without the target generator and without Llama (the rewriter), so its original-text values differ from those in Tables 5 and 6, which include Llama in training."/>
       </w:tblPr>
       <w:tblGrid>
         <w:gridCol w:w="1584"/>
@@ -10523,58 +10536,58 @@
                 <w:rFonts w:ascii="Times New Roman" w:hAnsi="Times New Roman"/>
                 <w:sz w:val="17"/>
               </w:rPr>
-              <w:t xml:space="preserve">Hybrid attack</w:t>
-            </w:r>
-          </w:p>
-        </w:tc>
-        <w:tc>
-          <w:tcPr/>
-          <w:p>
-            <w:pPr>
-              <w:pStyle w:val="Compact"/>
-              <w:spacing w:after="20" w:before="20" w:line="240" w:lineRule="auto"/>
-              <w:jc w:val="left"/>
-            </w:pPr>
-            <w:r>
-              <w:rPr>
-                <w:rFonts w:ascii="Times New Roman" w:hAnsi="Times New Roman"/>
-                <w:sz w:val="17"/>
-              </w:rPr>
-              <w:t xml:space="preserve">0.790 / 0.07</w:t>
-            </w:r>
-          </w:p>
-        </w:tc>
-        <w:tc>
-          <w:tcPr/>
-          <w:p>
-            <w:pPr>
-              <w:pStyle w:val="Compact"/>
-              <w:spacing w:after="20" w:before="20" w:line="240" w:lineRule="auto"/>
-              <w:jc w:val="left"/>
-            </w:pPr>
-            <w:r>
-              <w:rPr>
-                <w:rFonts w:ascii="Times New Roman" w:hAnsi="Times New Roman"/>
-                <w:sz w:val="17"/>
-              </w:rPr>
-              <w:t xml:space="preserve">0.975 / 0.87</w:t>
-            </w:r>
-          </w:p>
-        </w:tc>
-        <w:tc>
-          <w:tcPr/>
-          <w:p>
-            <w:pPr>
-              <w:pStyle w:val="Compact"/>
-              <w:spacing w:after="20" w:before="20" w:line="240" w:lineRule="auto"/>
-              <w:jc w:val="left"/>
-            </w:pPr>
-            <w:r>
-              <w:rPr>
-                <w:rFonts w:ascii="Times New Roman" w:hAnsi="Times New Roman"/>
-                <w:sz w:val="17"/>
-              </w:rPr>
-              <w:t xml:space="preserve">0.958 / 0.77</w:t>
+              <w:t xml:space="preserve">Edit only</w:t>
+            </w:r>
+          </w:p>
+        </w:tc>
+        <w:tc>
+          <w:tcPr/>
+          <w:p>
+            <w:pPr>
+              <w:pStyle w:val="Compact"/>
+              <w:spacing w:after="20" w:before="20" w:line="240" w:lineRule="auto"/>
+              <w:jc w:val="left"/>
+            </w:pPr>
+            <w:r>
+              <w:rPr>
+                <w:rFonts w:ascii="Times New Roman" w:hAnsi="Times New Roman"/>
+                <w:sz w:val="17"/>
+              </w:rPr>
+              <w:t xml:space="preserve">0.791 / 0.08</w:t>
+            </w:r>
+          </w:p>
+        </w:tc>
+        <w:tc>
+          <w:tcPr/>
+          <w:p>
+            <w:pPr>
+              <w:pStyle w:val="Compact"/>
+              <w:spacing w:after="20" w:before="20" w:line="240" w:lineRule="auto"/>
+              <w:jc w:val="left"/>
+            </w:pPr>
+            <w:r>
+              <w:rPr>
+                <w:rFonts w:ascii="Times New Roman" w:hAnsi="Times New Roman"/>
+                <w:sz w:val="17"/>
+              </w:rPr>
+              <w:t xml:space="preserve">0.980 / 0.85</w:t>
+            </w:r>
+          </w:p>
+        </w:tc>
+        <w:tc>
+          <w:tcPr/>
+          <w:p>
+            <w:pPr>
+              <w:pStyle w:val="Compact"/>
+              <w:spacing w:after="20" w:before="20" w:line="240" w:lineRule="auto"/>
+              <w:jc w:val="left"/>
+            </w:pPr>
+            <w:r>
+              <w:rPr>
+                <w:rFonts w:ascii="Times New Roman" w:hAnsi="Times New Roman"/>
+                <w:sz w:val="17"/>
+              </w:rPr>
+              <w:t xml:space="preserve">0.962 / 0.82</w:t>
             </w:r>
           </w:p>
         </w:tc>
@@ -10593,75 +10606,75 @@
                 <w:rFonts w:ascii="Times New Roman" w:hAnsi="Times New Roman"/>
                 <w:sz w:val="17"/>
               </w:rPr>
-              <w:t xml:space="preserve">Claude</w:t>
-            </w:r>
-          </w:p>
-        </w:tc>
-        <w:tc>
-          <w:tcPr/>
-          <w:p>
-            <w:pPr>
-              <w:pStyle w:val="Compact"/>
-              <w:spacing w:after="20" w:before="20" w:line="240" w:lineRule="auto"/>
-              <w:jc w:val="left"/>
-            </w:pPr>
-            <w:r>
-              <w:rPr>
-                <w:rFonts w:ascii="Times New Roman" w:hAnsi="Times New Roman"/>
-                <w:sz w:val="17"/>
-              </w:rPr>
-              <w:t xml:space="preserve">Original</w:t>
-            </w:r>
-          </w:p>
-        </w:tc>
-        <w:tc>
-          <w:tcPr/>
-          <w:p>
-            <w:pPr>
-              <w:pStyle w:val="Compact"/>
-              <w:spacing w:after="20" w:before="20" w:line="240" w:lineRule="auto"/>
-              <w:jc w:val="left"/>
-            </w:pPr>
-            <w:r>
-              <w:rPr>
-                <w:rFonts w:ascii="Times New Roman" w:hAnsi="Times New Roman"/>
-                <w:sz w:val="17"/>
-              </w:rPr>
-              <w:t xml:space="preserve">0.746 / 0.22</w:t>
-            </w:r>
-          </w:p>
-        </w:tc>
-        <w:tc>
-          <w:tcPr/>
-          <w:p>
-            <w:pPr>
-              <w:pStyle w:val="Compact"/>
-              <w:spacing w:after="20" w:before="20" w:line="240" w:lineRule="auto"/>
-              <w:jc w:val="left"/>
-            </w:pPr>
-            <w:r>
-              <w:rPr>
-                <w:rFonts w:ascii="Times New Roman" w:hAnsi="Times New Roman"/>
-                <w:sz w:val="17"/>
-              </w:rPr>
-              <w:t xml:space="preserve">0.656 / 0.01</w:t>
-            </w:r>
-          </w:p>
-        </w:tc>
-        <w:tc>
-          <w:tcPr/>
-          <w:p>
-            <w:pPr>
-              <w:pStyle w:val="Compact"/>
-              <w:spacing w:after="20" w:before="20" w:line="240" w:lineRule="auto"/>
-              <w:jc w:val="left"/>
-            </w:pPr>
-            <w:r>
-              <w:rPr>
-                <w:rFonts w:ascii="Times New Roman" w:hAnsi="Times New Roman"/>
-                <w:sz w:val="17"/>
-              </w:rPr>
-              <w:t xml:space="preserve">0.774 / 0.35</w:t>
+              <w:t xml:space="preserve">GPT-4o</w:t>
+            </w:r>
+          </w:p>
+        </w:tc>
+        <w:tc>
+          <w:tcPr/>
+          <w:p>
+            <w:pPr>
+              <w:pStyle w:val="Compact"/>
+              <w:spacing w:after="20" w:before="20" w:line="240" w:lineRule="auto"/>
+              <w:jc w:val="left"/>
+            </w:pPr>
+            <w:r>
+              <w:rPr>
+                <w:rFonts w:ascii="Times New Roman" w:hAnsi="Times New Roman"/>
+                <w:sz w:val="17"/>
+              </w:rPr>
+              <w:t xml:space="preserve">Hybrid attack</w:t>
+            </w:r>
+          </w:p>
+        </w:tc>
+        <w:tc>
+          <w:tcPr/>
+          <w:p>
+            <w:pPr>
+              <w:pStyle w:val="Compact"/>
+              <w:spacing w:after="20" w:before="20" w:line="240" w:lineRule="auto"/>
+              <w:jc w:val="left"/>
+            </w:pPr>
+            <w:r>
+              <w:rPr>
+                <w:rFonts w:ascii="Times New Roman" w:hAnsi="Times New Roman"/>
+                <w:sz w:val="17"/>
+              </w:rPr>
+              <w:t xml:space="preserve">0.790 / 0.07</w:t>
+            </w:r>
+          </w:p>
+        </w:tc>
+        <w:tc>
+          <w:tcPr/>
+          <w:p>
+            <w:pPr>
+              <w:pStyle w:val="Compact"/>
+              <w:spacing w:after="20" w:before="20" w:line="240" w:lineRule="auto"/>
+              <w:jc w:val="left"/>
+            </w:pPr>
+            <w:r>
+              <w:rPr>
+                <w:rFonts w:ascii="Times New Roman" w:hAnsi="Times New Roman"/>
+                <w:sz w:val="17"/>
+              </w:rPr>
+              <w:t xml:space="preserve">0.975 / 0.87</w:t>
+            </w:r>
+          </w:p>
+        </w:tc>
+        <w:tc>
+          <w:tcPr/>
+          <w:p>
+            <w:pPr>
+              <w:pStyle w:val="Compact"/>
+              <w:spacing w:after="20" w:before="20" w:line="240" w:lineRule="auto"/>
+              <w:jc w:val="left"/>
+            </w:pPr>
+            <w:r>
+              <w:rPr>
+                <w:rFonts w:ascii="Times New Roman" w:hAnsi="Times New Roman"/>
+                <w:sz w:val="17"/>
+              </w:rPr>
+              <w:t xml:space="preserve">0.958 / 0.77</w:t>
             </w:r>
           </w:p>
         </w:tc>
@@ -10697,58 +10710,58 @@
                 <w:rFonts w:ascii="Times New Roman" w:hAnsi="Times New Roman"/>
                 <w:sz w:val="17"/>
               </w:rPr>
-              <w:t xml:space="preserve">Hybrid attack</w:t>
-            </w:r>
-          </w:p>
-        </w:tc>
-        <w:tc>
-          <w:tcPr/>
-          <w:p>
-            <w:pPr>
-              <w:pStyle w:val="Compact"/>
-              <w:spacing w:after="20" w:before="20" w:line="240" w:lineRule="auto"/>
-              <w:jc w:val="left"/>
-            </w:pPr>
-            <w:r>
-              <w:rPr>
-                <w:rFonts w:ascii="Times New Roman" w:hAnsi="Times New Roman"/>
-                <w:sz w:val="17"/>
-              </w:rPr>
-              <w:t xml:space="preserve">0.536 / 0.03</w:t>
-            </w:r>
-          </w:p>
-        </w:tc>
-        <w:tc>
-          <w:tcPr/>
-          <w:p>
-            <w:pPr>
-              <w:pStyle w:val="Compact"/>
-              <w:spacing w:after="20" w:before="20" w:line="240" w:lineRule="auto"/>
-              <w:jc w:val="left"/>
-            </w:pPr>
-            <w:r>
-              <w:rPr>
-                <w:rFonts w:ascii="Times New Roman" w:hAnsi="Times New Roman"/>
-                <w:sz w:val="17"/>
-              </w:rPr>
-              <w:t xml:space="preserve">0.840 / 0.35</w:t>
-            </w:r>
-          </w:p>
-        </w:tc>
-        <w:tc>
-          <w:tcPr/>
-          <w:p>
-            <w:pPr>
-              <w:pStyle w:val="Compact"/>
-              <w:spacing w:after="20" w:before="20" w:line="240" w:lineRule="auto"/>
-              <w:jc w:val="left"/>
-            </w:pPr>
-            <w:r>
-              <w:rPr>
-                <w:rFonts w:ascii="Times New Roman" w:hAnsi="Times New Roman"/>
-                <w:sz w:val="17"/>
-              </w:rPr>
-              <w:t xml:space="preserve">0.760 / 0.26</w:t>
+              <w:t xml:space="preserve">Original</w:t>
+            </w:r>
+          </w:p>
+        </w:tc>
+        <w:tc>
+          <w:tcPr/>
+          <w:p>
+            <w:pPr>
+              <w:pStyle w:val="Compact"/>
+              <w:spacing w:after="20" w:before="20" w:line="240" w:lineRule="auto"/>
+              <w:jc w:val="left"/>
+            </w:pPr>
+            <w:r>
+              <w:rPr>
+                <w:rFonts w:ascii="Times New Roman" w:hAnsi="Times New Roman"/>
+                <w:sz w:val="17"/>
+              </w:rPr>
+              <w:t xml:space="preserve">0.746 / 0.22</w:t>
+            </w:r>
+          </w:p>
+        </w:tc>
+        <w:tc>
+          <w:tcPr/>
+          <w:p>
+            <w:pPr>
+              <w:pStyle w:val="Compact"/>
+              <w:spacing w:after="20" w:before="20" w:line="240" w:lineRule="auto"/>
+              <w:jc w:val="left"/>
+            </w:pPr>
+            <w:r>
+              <w:rPr>
+                <w:rFonts w:ascii="Times New Roman" w:hAnsi="Times New Roman"/>
+                <w:sz w:val="17"/>
+              </w:rPr>
+              <w:t xml:space="preserve">0.656 / 0.01</w:t>
+            </w:r>
+          </w:p>
+        </w:tc>
+        <w:tc>
+          <w:tcPr/>
+          <w:p>
+            <w:pPr>
+              <w:pStyle w:val="Compact"/>
+              <w:spacing w:after="20" w:before="20" w:line="240" w:lineRule="auto"/>
+              <w:jc w:val="left"/>
+            </w:pPr>
+            <w:r>
+              <w:rPr>
+                <w:rFonts w:ascii="Times New Roman" w:hAnsi="Times New Roman"/>
+                <w:sz w:val="17"/>
+              </w:rPr>
+              <w:t xml:space="preserve">0.774 / 0.35</w:t>
             </w:r>
           </w:p>
         </w:tc>
@@ -10767,6 +10780,180 @@
                 <w:rFonts w:ascii="Times New Roman" w:hAnsi="Times New Roman"/>
                 <w:sz w:val="17"/>
               </w:rPr>
+              <w:t xml:space="preserve">Claude</w:t>
+            </w:r>
+          </w:p>
+        </w:tc>
+        <w:tc>
+          <w:tcPr/>
+          <w:p>
+            <w:pPr>
+              <w:pStyle w:val="Compact"/>
+              <w:spacing w:after="20" w:before="20" w:line="240" w:lineRule="auto"/>
+              <w:jc w:val="left"/>
+            </w:pPr>
+            <w:r>
+              <w:rPr>
+                <w:rFonts w:ascii="Times New Roman" w:hAnsi="Times New Roman"/>
+                <w:sz w:val="17"/>
+              </w:rPr>
+              <w:t xml:space="preserve">Edit only</w:t>
+            </w:r>
+          </w:p>
+        </w:tc>
+        <w:tc>
+          <w:tcPr/>
+          <w:p>
+            <w:pPr>
+              <w:pStyle w:val="Compact"/>
+              <w:spacing w:after="20" w:before="20" w:line="240" w:lineRule="auto"/>
+              <w:jc w:val="left"/>
+            </w:pPr>
+            <w:r>
+              <w:rPr>
+                <w:rFonts w:ascii="Times New Roman" w:hAnsi="Times New Roman"/>
+                <w:sz w:val="17"/>
+              </w:rPr>
+              <w:t xml:space="preserve">0.493 / 0.03</w:t>
+            </w:r>
+          </w:p>
+        </w:tc>
+        <w:tc>
+          <w:tcPr/>
+          <w:p>
+            <w:pPr>
+              <w:pStyle w:val="Compact"/>
+              <w:spacing w:after="20" w:before="20" w:line="240" w:lineRule="auto"/>
+              <w:jc w:val="left"/>
+            </w:pPr>
+            <w:r>
+              <w:rPr>
+                <w:rFonts w:ascii="Times New Roman" w:hAnsi="Times New Roman"/>
+                <w:sz w:val="17"/>
+              </w:rPr>
+              <w:t xml:space="preserve">0.734 / 0.05</w:t>
+            </w:r>
+          </w:p>
+        </w:tc>
+        <w:tc>
+          <w:tcPr/>
+          <w:p>
+            <w:pPr>
+              <w:pStyle w:val="Compact"/>
+              <w:spacing w:after="20" w:before="20" w:line="240" w:lineRule="auto"/>
+              <w:jc w:val="left"/>
+            </w:pPr>
+            <w:r>
+              <w:rPr>
+                <w:rFonts w:ascii="Times New Roman" w:hAnsi="Times New Roman"/>
+                <w:sz w:val="17"/>
+              </w:rPr>
+              <w:t xml:space="preserve">0.664 / 0.11</w:t>
+            </w:r>
+          </w:p>
+        </w:tc>
+      </w:tr>
+      <w:tr>
+        <w:tc>
+          <w:tcPr/>
+          <w:p>
+            <w:pPr>
+              <w:pStyle w:val="Compact"/>
+              <w:spacing w:after="20" w:before="20" w:line="240" w:lineRule="auto"/>
+              <w:jc w:val="left"/>
+            </w:pPr>
+            <w:r>
+              <w:rPr>
+                <w:rFonts w:ascii="Times New Roman" w:hAnsi="Times New Roman"/>
+                <w:sz w:val="17"/>
+              </w:rPr>
+              <w:t xml:space="preserve">Claude</w:t>
+            </w:r>
+          </w:p>
+        </w:tc>
+        <w:tc>
+          <w:tcPr/>
+          <w:p>
+            <w:pPr>
+              <w:pStyle w:val="Compact"/>
+              <w:spacing w:after="20" w:before="20" w:line="240" w:lineRule="auto"/>
+              <w:jc w:val="left"/>
+            </w:pPr>
+            <w:r>
+              <w:rPr>
+                <w:rFonts w:ascii="Times New Roman" w:hAnsi="Times New Roman"/>
+                <w:sz w:val="17"/>
+              </w:rPr>
+              <w:t xml:space="preserve">Hybrid attack</w:t>
+            </w:r>
+          </w:p>
+        </w:tc>
+        <w:tc>
+          <w:tcPr/>
+          <w:p>
+            <w:pPr>
+              <w:pStyle w:val="Compact"/>
+              <w:spacing w:after="20" w:before="20" w:line="240" w:lineRule="auto"/>
+              <w:jc w:val="left"/>
+            </w:pPr>
+            <w:r>
+              <w:rPr>
+                <w:rFonts w:ascii="Times New Roman" w:hAnsi="Times New Roman"/>
+                <w:sz w:val="17"/>
+              </w:rPr>
+              <w:t xml:space="preserve">0.536 / 0.03</w:t>
+            </w:r>
+          </w:p>
+        </w:tc>
+        <w:tc>
+          <w:tcPr/>
+          <w:p>
+            <w:pPr>
+              <w:pStyle w:val="Compact"/>
+              <w:spacing w:after="20" w:before="20" w:line="240" w:lineRule="auto"/>
+              <w:jc w:val="left"/>
+            </w:pPr>
+            <w:r>
+              <w:rPr>
+                <w:rFonts w:ascii="Times New Roman" w:hAnsi="Times New Roman"/>
+                <w:sz w:val="17"/>
+              </w:rPr>
+              <w:t xml:space="preserve">0.840 / 0.35</w:t>
+            </w:r>
+          </w:p>
+        </w:tc>
+        <w:tc>
+          <w:tcPr/>
+          <w:p>
+            <w:pPr>
+              <w:pStyle w:val="Compact"/>
+              <w:spacing w:after="20" w:before="20" w:line="240" w:lineRule="auto"/>
+              <w:jc w:val="left"/>
+            </w:pPr>
+            <w:r>
+              <w:rPr>
+                <w:rFonts w:ascii="Times New Roman" w:hAnsi="Times New Roman"/>
+                <w:sz w:val="17"/>
+              </w:rPr>
+              <w:t xml:space="preserve">0.760 / 0.26</w:t>
+            </w:r>
+          </w:p>
+        </w:tc>
+      </w:tr>
+      <w:tr>
+        <w:tc>
+          <w:tcPr/>
+          <w:p>
+            <w:pPr>
+              <w:pStyle w:val="Compact"/>
+              <w:spacing w:after="20" w:before="20" w:line="240" w:lineRule="auto"/>
+              <w:jc w:val="left"/>
+            </w:pPr>
+            <w:r>
+              <w:rPr>
+                <w:rFonts w:ascii="Times New Roman" w:hAnsi="Times New Roman"/>
+                <w:sz w:val="17"/>
+              </w:rPr>
               <w:t xml:space="preserve">Llama</w:t>
             </w:r>
           </w:p>
@@ -10836,6 +11023,93 @@
                 <w:sz w:val="17"/>
               </w:rPr>
               <w:t xml:space="preserve">0.989 / 0.96</w:t>
+            </w:r>
+          </w:p>
+        </w:tc>
+      </w:tr>
+      <w:tr>
+        <w:tc>
+          <w:tcPr/>
+          <w:p>
+            <w:pPr>
+              <w:pStyle w:val="Compact"/>
+              <w:spacing w:after="20" w:before="20" w:line="240" w:lineRule="auto"/>
+              <w:jc w:val="left"/>
+            </w:pPr>
+            <w:r>
+              <w:rPr>
+                <w:rFonts w:ascii="Times New Roman" w:hAnsi="Times New Roman"/>
+                <w:sz w:val="17"/>
+              </w:rPr>
+              <w:t xml:space="preserve">Llama</w:t>
+            </w:r>
+          </w:p>
+        </w:tc>
+        <w:tc>
+          <w:tcPr/>
+          <w:p>
+            <w:pPr>
+              <w:pStyle w:val="Compact"/>
+              <w:spacing w:after="20" w:before="20" w:line="240" w:lineRule="auto"/>
+              <w:jc w:val="left"/>
+            </w:pPr>
+            <w:r>
+              <w:rPr>
+                <w:rFonts w:ascii="Times New Roman" w:hAnsi="Times New Roman"/>
+                <w:sz w:val="17"/>
+              </w:rPr>
+              <w:t xml:space="preserve">Edit only</w:t>
+            </w:r>
+          </w:p>
+        </w:tc>
+        <w:tc>
+          <w:tcPr/>
+          <w:p>
+            <w:pPr>
+              <w:pStyle w:val="Compact"/>
+              <w:spacing w:after="20" w:before="20" w:line="240" w:lineRule="auto"/>
+              <w:jc w:val="left"/>
+            </w:pPr>
+            <w:r>
+              <w:rPr>
+                <w:rFonts w:ascii="Times New Roman" w:hAnsi="Times New Roman"/>
+                <w:sz w:val="17"/>
+              </w:rPr>
+              <w:t xml:space="preserve">0.721 / 0.15</w:t>
+            </w:r>
+          </w:p>
+        </w:tc>
+        <w:tc>
+          <w:tcPr/>
+          <w:p>
+            <w:pPr>
+              <w:pStyle w:val="Compact"/>
+              <w:spacing w:after="20" w:before="20" w:line="240" w:lineRule="auto"/>
+              <w:jc w:val="left"/>
+            </w:pPr>
+            <w:r>
+              <w:rPr>
+                <w:rFonts w:ascii="Times New Roman" w:hAnsi="Times New Roman"/>
+                <w:sz w:val="17"/>
+              </w:rPr>
+              <w:t xml:space="preserve">0.986 / 0.95</w:t>
+            </w:r>
+          </w:p>
+        </w:tc>
+        <w:tc>
+          <w:tcPr/>
+          <w:p>
+            <w:pPr>
+              <w:pStyle w:val="Compact"/>
+              <w:spacing w:after="20" w:before="20" w:line="240" w:lineRule="auto"/>
+              <w:jc w:val="left"/>
+            </w:pPr>
+            <w:r>
+              <w:rPr>
+                <w:rFonts w:ascii="Times New Roman" w:hAnsi="Times New Roman"/>
+                <w:sz w:val="17"/>
+              </w:rPr>
+              <w:t xml:space="preserve">0.943 / 0.66</w:t>
             </w:r>
           </w:p>
         </w:tc>
@@ -11773,7 +12047,7 @@
         <w:pStyle w:val="BodyText"/>
       </w:pPr>
       <w:r>
-        <w:t xml:space="preserve">Third, a screen whose features are known is fragile. A crude edit of five easily changed events cut detection from 53% to 8%, whereas a generic LLM rewrite did not evade the screen and for one generator made detection easier, so the fragility lies in knowing the features and not in rewriting power as such. Publishing the features, as research does, supplies that knowledge. The model shows why the edit result should be expected: when evasion is cheap relative to the stakes, equilibrium detection is far below the figure that non-adaptive authors would produce. The detectability paradox means that a very effective screen can provoke enough evasion to underperform a weaker one. Designing a screen therefore means choosing features that are costly to manipulate, not only features that discriminate. In our data, passives and nominalizations played that role, which echoes the economic logic that a signal is informative only to the extent that it is costly to fake (Spence 1973; Connelly et al. 2011). Because we publish our method, the relevant benchmark for any deployed version is the equilibrium detection rate, not the headline accuracy in this paper. The judge, by contrast, was not fooled by the hybrid attack that defeated the screen, which suggests that the two stages of a cascade differ in robustness as well as in price. A cascade that gates the judge with a known, editable screen inherits the screen’s fragility, and one that gates it with features that are costly to edit would not.</w:t>
+        <w:t xml:space="preserve">Third, a screen whose features are known is fragile. A crude edit of five easily changed events cut detection from 53% to 8%, whereas a generic LLM rewrite did not evade the screen and for one generator made detection easier, so the fragility lies in knowing the features and not in rewriting power as such. Publishing the features, as research does, supplies that knowledge. The model shows why the edit result should be expected: when evasion is cheap relative to the stakes, equilibrium detection is far below the figure that non-adaptive authors would produce. The detectability paradox means that a very effective screen can provoke enough evasion to underperform a weaker one. Designing a screen therefore means choosing features that are costly to manipulate, not only features that discriminate. In our data, passives and nominalizations played that role, which echoes the economic logic that a signal is informative only to the extent that it is costly to fake (Spence 1973; Connelly et al. 2011). Because we publish our method, the relevant benchmark for any deployed version is the equilibrium detection rate, not the headline accuracy in this paper. The judge, by contrast, was not fooled by the attacks that defeated the screen, neither the edit alone nor the hybrid, which suggests that the two stages of a cascade differ in robustness as well as in price. A cascade that gates the judge with a known, editable screen inherits the screen’s fragility, and one that gates it with features that are costly to edit would not.</w:t>
       </w:r>
     </w:p>
     <w:p>
@@ -11815,7 +12089,7 @@
         <w:pStyle w:val="BodyText"/>
       </w:pPr>
       <w:r>
-        <w:t xml:space="preserve">The economic model is simple. It assumes that investigating a flagged paper settles its status at a fixed cost, which is generous given that human reviewers often cannot distinguish machine text, and that capacity is unlimited. The costs of review and of a missed paper and the base rate are assumed, not measured, so the cost results are structural illustrations and not estimates for any organization. The judge’s operating point is fixed at a threshold of 50. The strategic extension considers a single decision by a single author, takes the base rate as given, and uses a quadratic cost of effort. The programmatic adversarial test is crude; it is a lower bound on an adaptive author, who could edit passives and nominalizations too, or optimize against the detector’s weights. The generic LLM rewrite used a single attacker (Llama), a single prompt, and the clustering screen only. The hybrid of rewriting and feature-aware editing was no stronger than the edit alone, but neither attack edits passives and nominalizations or optimizes against the detector’s weights, so an adaptive author could do better than any of our attacks. The hard-to-edit feature set was chosen because our attack left it untouched, so its robustness is conditional on that attack. The judge was evaluated only on the hybrid-attacked papers, with one attacker, so we cannot separate the effect of the edit from that of the rewrite, and we did not evaluate it on rewrite-only or edit-only papers or evaluate the GPT-4o judge on any attacked papers. The programmatic edits might be noticed by a human reader. We did not run MAUVE or BERTScore, we did not test light human editing of machine text, and we did not test whether explainable evidence improves human decisions.</w:t>
+        <w:t xml:space="preserve">The economic model is simple. It assumes that investigating a flagged paper settles its status at a fixed cost, which is generous given that human reviewers often cannot distinguish machine text, and that capacity is unlimited. The costs of review and of a missed paper and the base rate are assumed, not measured, so the cost results are structural illustrations and not estimates for any organization. The judge’s operating point is fixed at a threshold of 50. The strategic extension considers a single decision by a single author, takes the base rate as given, and uses a quadratic cost of effort. The programmatic adversarial test is crude; it is a lower bound on an adaptive author, who could edit passives and nominalizations too, or optimize against the detector’s weights. The generic LLM rewrite used a single attacker (Llama), a single prompt, and the clustering screen only. The hybrid of rewriting and feature-aware editing was no stronger than the edit alone, but neither attack edits passives and nominalizations or optimizes against the detector’s weights, so an adaptive author could do better than any of our attacks. The hard-to-edit feature set was chosen because our attack left it untouched, so its robustness is conditional on that attack. The judge was evaluated on edit-only and hybrid-attacked papers but not on rewrite-only papers, with one attacker and the Gemini judge only; the GPT-4o judge was not evaluated on attacked papers. The judge saw edits that an adaptive author could conceal better, and a human reader might notice them. We did not run MAUVE or BERTScore, we did not test light human editing of machine text, and we did not test whether explainable evidence improves human decisions.</w:t>
       </w:r>
     </w:p>
     <w:p>
@@ -11823,7 +12097,7 @@
         <w:pStyle w:val="BodyText"/>
       </w:pPr>
       <w:r>
-        <w:t xml:space="preserve">Four steps would turn this pilot into a fuller test. The first is a stronger adversary: an attack that also edits passives and nominalizations or optimizes against the detector’s weights, evaluated against both the screen and the judges, with edit-only and rewrite-only papers also given to the judge, and with more than one attacker model. The second is to measure the parameters the model needs, with data on the base rate of machine-written submissions, on the cost of investigating a flag, and on the accuracy of human review, which would replace our illustrative values. The third is to add generators, especially open-weight models and future releases, and to replace the Poisson benchmark with a negative binomial reference and the moment estimator with a full likelihood. The fourth is a randomized experiment in which domain experts classify real and fabricated papers with and without an explainable indicator, which would test whether the transparency of count-based features improves decisions.</w:t>
+        <w:t xml:space="preserve">Four steps would turn this pilot into a fuller test. The first is a stronger adversary: an attack that also edits passives and nominalizations or optimizes against the detector’s weights, evaluated against both the screen and the judges, with rewrite-only papers also given to the judge, and with more than one attacker model. The second is to measure the parameters the model needs, with data on the base rate of machine-written submissions, on the cost of investigating a flag, and on the accuracy of human review, which would replace our illustrative values. The third is to add generators, especially open-weight models and future releases, and to replace the Poisson benchmark with a negative binomial reference and the moment estimator with a full likelihood. The fourth is a randomized experiment in which domain experts classify real and fabricated papers with and without an explainable indicator, which would test whether the transparency of count-based features improves decisions.</w:t>
       </w:r>
     </w:p>
     <w:bookmarkEnd w:id="49"/>
@@ -11841,7 +12115,7 @@
         <w:pStyle w:val="FirstParagraph"/>
       </w:pPr>
       <w:r>
-        <w:t xml:space="preserve">Whether to screen for machine-written scholarly text is an economic decision, and the value of a screen depends on three things that detection accuracy leaves out: the base rate of machine papers, the cost of false alarms and misses, and how authors respond. In a model of cascaded screening, a free statistical screen is worth most because it raises the base rate that an expensive judge sees, a judge with a blind spot is worth little, and a screen whose features are known can lose most of its power through evasion. Calibrated on three generators, the cheap screen detected machine papers well only within a generator, a strong LLM judge missed one generator almost completely, a simple cascade kept most of the judge’s detection at a fraction of its cost when machine papers were rare, and a crude feature-aware edit cut the screen’s detection from 53% to 8%, whereas a generic LLM rewrite did not evade it. The same edit, applied after a rewrite, did not fool the judge, and the cascade, which depends on the screen, lost much of its detection when attacked. Organizations should therefore evaluate screens by their equilibrium performance against adapting authors, favor features that are costly to manipulate, and plan to maintain them. The evidence comes from three generators, one genre, and two judges, and a stronger adversary and measured cost parameters would be needed to turn these illustrations into estimates.</w:t>
+        <w:t xml:space="preserve">Whether to screen for machine-written scholarly text is an economic decision, and the value of a screen depends on three things that detection accuracy leaves out: the base rate of machine papers, the cost of false alarms and misses, and how authors respond. In a model of cascaded screening, a free statistical screen is worth most because it raises the base rate that an expensive judge sees, a judge with a blind spot is worth little, and a screen whose features are known can lose most of its power through evasion. Calibrated on three generators, the cheap screen detected machine papers well only within a generator, a strong LLM judge missed one generator almost completely, a simple cascade kept most of the judge’s detection at a fraction of its cost when machine papers were rare, and a crude feature-aware edit cut the screen’s detection from 53% to 8%, whereas a generic LLM rewrite did not evade it. The same edit, alone or after a rewrite, did not fool the judge, and the cascade, which depends on the screen, lost much of its detection when attacked. Organizations should therefore evaluate screens by their equilibrium performance against adapting authors, favor features that are costly to manipulate, and plan to maintain them. The evidence comes from three generators, one genre, and two judges, and a stronger adversary and measured cost parameters would be needed to turn these illustrations into estimates.</w:t>
       </w:r>
     </w:p>
     <w:bookmarkEnd w:id="50"/>

</xml_diff>